<commit_message>
Refactor documentation for Move-ArchivedLogs-ByADGroup
- Updated the Design Document to streamline content and remove redundant information.
- Revised the Implementation Guide for clarity, focusing on prerequisites and step-by-step instructions.
- Enhanced the User Guide by simplifying the structure and improving readability.
- Consolidated the Validation & Testing Plan, ensuring it aligns with the current workflow and testing requirements.
- Removed unnecessary details and improved formatting across all documentation files.
</commit_message>
<xml_diff>
--- a/Ansible to Orchestrator Transition/Completed/Move Windows Event Logs/Move-ArchivedLogs-ByADGroup/Documentation/01_Executive_Summary.docx
+++ b/Ansible to Orchestrator Transition/Completed/Move Windows Event Logs/Move-ArchivedLogs-ByADGroup/Documentation/01_Executive_Summary.docx
@@ -1,212 +1,337 @@
 
 <file path=word/document.xml><?xml version="1.0" encoding="utf-8"?>
-<w:document xmlns:w="http://schemas.openxmlformats.org/wordprocessingml/2006/main" xmlns:m="http://schemas.openxmlformats.org/officeDocument/2006/math" xmlns:r="http://schemas.openxmlformats.org/officeDocument/2006/relationships" xmlns:o="urn:schemas-microsoft-com:office:office" xmlns:v="urn:schemas-microsoft-com:vml" xmlns:w10="urn:schemas-microsoft-com:office:word" xmlns:a="http://schemas.openxmlformats.org/drawingml/2006/main" xmlns:pic="http://schemas.openxmlformats.org/drawingml/2006/picture" xmlns:wp="http://schemas.openxmlformats.org/drawingml/2006/wordprocessingDrawing">
+<w:document xmlns:wpc="http://schemas.microsoft.com/office/word/2010/wordprocessingCanvas" xmlns:cx="http://schemas.microsoft.com/office/drawing/2014/chartex" xmlns:cx1="http://schemas.microsoft.com/office/drawing/2015/9/8/chartex" xmlns:cx2="http://schemas.microsoft.com/office/drawing/2015/10/21/chartex" xmlns:cx3="http://schemas.microsoft.com/office/drawing/2016/5/9/chartex" xmlns:cx4="http://schemas.microsoft.com/office/drawing/2016/5/10/chartex" xmlns:cx5="http://schemas.microsoft.com/office/drawing/2016/5/11/chartex" xmlns:cx6="http://schemas.microsoft.com/office/drawing/2016/5/12/chartex" xmlns:cx7="http://schemas.microsoft.com/office/drawing/2016/5/13/chartex" xmlns:cx8="http://schemas.microsoft.com/office/drawing/2016/5/14/chartex" xmlns:mc="http://schemas.openxmlformats.org/markup-compatibility/2006" xmlns:aink="http://schemas.microsoft.com/office/drawing/2016/ink" xmlns:am3d="http://schemas.microsoft.com/office/drawing/2017/model3d" xmlns:o="urn:schemas-microsoft-com:office:office" xmlns:oel="http://schemas.microsoft.com/office/2019/extlst" xmlns:r="http://schemas.openxmlformats.org/officeDocument/2006/relationships" xmlns:m="http://schemas.openxmlformats.org/officeDocument/2006/math" xmlns:v="urn:schemas-microsoft-com:vml" xmlns:wp14="http://schemas.microsoft.com/office/word/2010/wordprocessingDrawing" xmlns:wp="http://schemas.openxmlformats.org/drawingml/2006/wordprocessingDrawing" xmlns:w10="urn:schemas-microsoft-com:office:word" xmlns:w="http://schemas.openxmlformats.org/wordprocessingml/2006/main" xmlns:w14="http://schemas.microsoft.com/office/word/2010/wordml" xmlns:w15="http://schemas.microsoft.com/office/word/2012/wordml" xmlns:w16cex="http://schemas.microsoft.com/office/word/2018/wordml/cex" xmlns:w16cid="http://schemas.microsoft.com/office/word/2016/wordml/cid" xmlns:w16="http://schemas.microsoft.com/office/word/2018/wordml" xmlns:w16du="http://schemas.microsoft.com/office/word/2023/wordml/word16du" xmlns:w16sdtdh="http://schemas.microsoft.com/office/word/2020/wordml/sdtdatahash" xmlns:w16sdtfl="http://schemas.microsoft.com/office/word/2024/wordml/sdtformatlock" xmlns:w16se="http://schemas.microsoft.com/office/word/2015/wordml/symex" xmlns:wpg="http://schemas.microsoft.com/office/word/2010/wordprocessingGroup" xmlns:wpi="http://schemas.microsoft.com/office/word/2010/wordprocessingInk" xmlns:wne="http://schemas.microsoft.com/office/word/2006/wordml" xmlns:wps="http://schemas.microsoft.com/office/word/2010/wordprocessingShape" mc:Ignorable="w14 w15 w16se w16cid w16 w16cex w16sdtdh w16sdtfl w16du wp14">
   <w:body>
-    <w:bookmarkStart w:id="14" w:name="Xae23e343fb1be7e5253bc797e42e4bcfd403704"/>
     <w:p>
       <w:pPr>
         <w:pStyle w:val="Heading1"/>
       </w:pPr>
-      <w:r>
-        <w:t xml:space="preserve">Move Archived Logs (By AD Group) — Executive Summary</w:t>
+      <w:bookmarkStart w:id="0" w:name="Xae23e343fb1be7e5253bc797e42e4bcfd403704"/>
+      <w:r>
+        <w:t>Move Archived Logs (By AD Group) — Executive Summary</w:t>
       </w:r>
     </w:p>
     <w:p>
+      <w:r>
+        <w:pict w14:anchorId="14B8C89A">
+          <v:rect id="_x0000_i1025" style="width:0;height:1.5pt" o:hralign="center" o:hrstd="t" o:hr="t"/>
+        </w:pict>
+      </w:r>
+    </w:p>
+    <w:p>
+      <w:pPr>
+        <w:pStyle w:val="Heading2"/>
+      </w:pPr>
+      <w:bookmarkStart w:id="1" w:name="objective"/>
+      <w:r>
+        <w:t>Objective</w:t>
+      </w:r>
+    </w:p>
+    <w:p>
       <w:pPr>
         <w:pStyle w:val="FirstParagraph"/>
       </w:pPr>
+      <w:r>
+        <w:t xml:space="preserve">Replace the retiring Ansible automation that moves Windows event-log archives with one supported VCF Orchestrator workflow — </w:t>
+      </w:r>
       <w:r>
         <w:rPr>
           <w:b/>
           <w:bCs/>
         </w:rPr>
-        <w:t xml:space="preserve">Deliverable:</w:t>
-      </w:r>
-      <w:r>
-        <w:t xml:space="preserve"> </w:t>
-      </w:r>
-      <w:r>
-        <w:t xml:space="preserve">Move-ArchivedLogs-ByADGroup</w:t>
-      </w:r>
-      <w:r>
-        <w:t xml:space="preserve"> </w:t>
-      </w:r>
+        <w:t>Move-ArchivedLogs-ByADGroup</w:t>
+      </w:r>
+      <w:r>
+        <w:t xml:space="preserve"> — reusing the proven </w:t>
+      </w:r>
+      <w:r>
+        <w:rPr>
+          <w:rStyle w:val="VerbatimChar"/>
+        </w:rPr>
+        <w:t>cvs_functions.ps1</w:t>
+      </w:r>
+      <w:r>
+        <w:t xml:space="preserve"> PowerShell logic rather than rewriting it.</w:t>
+      </w:r>
+    </w:p>
+    <w:p>
+      <w:pPr>
+        <w:pStyle w:val="BodyText"/>
+      </w:pPr>
+      <w:r>
+        <w:t xml:space="preserve">Business outcome: automated offload of Windows </w:t>
+      </w:r>
+      <w:r>
+        <w:rPr>
+          <w:rStyle w:val="VerbatimChar"/>
+        </w:rPr>
+        <w:t>Archive-*.evtx</w:t>
+      </w:r>
+      <w:r>
+        <w:t xml:space="preserve"> logs continues uninterrupted after Ansible is decommissioned, on a platform the customer already owns.</w:t>
+      </w:r>
+    </w:p>
+    <w:p>
+      <w:pPr>
+        <w:pStyle w:val="Heading2"/>
+      </w:pPr>
+      <w:bookmarkStart w:id="2" w:name="scope"/>
+      <w:bookmarkEnd w:id="1"/>
+      <w:r>
+        <w:t>Scope</w:t>
+      </w:r>
+    </w:p>
+    <w:p>
+      <w:pPr>
+        <w:pStyle w:val="FirstParagraph"/>
+      </w:pPr>
       <w:r>
         <w:rPr>
           <w:b/>
           <w:bCs/>
         </w:rPr>
-        <w:t xml:space="preserve">Project:</w:t>
-      </w:r>
-      <w:r>
-        <w:t xml:space="preserve"> </w:t>
-      </w:r>
-      <w:r>
-        <w:t xml:space="preserve">Ansible → VCF Orchestrator transition — "Move Windows Event Logs"</w:t>
-      </w:r>
-      <w:r>
-        <w:t xml:space="preserve"> </w:t>
+        <w:t>In scope</w:t>
+      </w:r>
+    </w:p>
+    <w:p>
+      <w:pPr>
+        <w:pStyle w:val="Compact"/>
+        <w:numPr>
+          <w:ilvl w:val="0"/>
+          <w:numId w:val="2"/>
+        </w:numPr>
+      </w:pPr>
+      <w:r>
+        <w:t xml:space="preserve">One Orchestrator workflow: </w:t>
       </w:r>
       <w:r>
         <w:rPr>
           <w:b/>
           <w:bCs/>
         </w:rPr>
-        <w:t xml:space="preserve">Platform:</w:t>
-      </w:r>
-      <w:r>
-        <w:t xml:space="preserve"> </w:t>
-      </w:r>
-      <w:r>
-        <w:t xml:space="preserve">VCF Automation 9 / VCF Operations Orchestrator 9</w:t>
-      </w:r>
-      <w:r>
-        <w:t xml:space="preserve"> </w:t>
+        <w:t>Move-ArchivedLogs-ByADGroup</w:t>
+      </w:r>
+      <w:r>
+        <w:t xml:space="preserve"> — move </w:t>
+      </w:r>
+      <w:r>
+        <w:rPr>
+          <w:rStyle w:val="VerbatimChar"/>
+        </w:rPr>
+        <w:t>Archive-*.evtx</w:t>
+      </w:r>
+      <w:r>
+        <w:t xml:space="preserve"> off every </w:t>
       </w:r>
       <w:r>
         <w:rPr>
           <w:b/>
           <w:bCs/>
         </w:rPr>
-        <w:t xml:space="preserve">Status:</w:t>
-      </w:r>
-      <w:r>
-        <w:t xml:space="preserve"> </w:t>
-      </w:r>
-      <w:r>
-        <w:t xml:space="preserve">Phase 1</w:t>
-      </w:r>
-      <w:r>
-        <w:t xml:space="preserve"> </w:t>
+        <w:t>enabled</w:t>
+      </w:r>
+      <w:r>
+        <w:t xml:space="preserve"> member of an AD group to a central archive share, into a per-server subfolder.</w:t>
+      </w:r>
+    </w:p>
+    <w:p>
+      <w:pPr>
+        <w:pStyle w:val="Compact"/>
+        <w:numPr>
+          <w:ilvl w:val="0"/>
+          <w:numId w:val="2"/>
+        </w:numPr>
+      </w:pPr>
+      <w:r>
+        <w:t xml:space="preserve">The deliverable-specific action </w:t>
       </w:r>
       <w:r>
         <w:rPr>
           <w:b/>
           <w:bCs/>
         </w:rPr>
-        <w:t xml:space="preserve">This set:</w:t>
-      </w:r>
-      <w:r>
-        <w:t xml:space="preserve"> </w:t>
-      </w:r>
-      <w:r>
-        <w:t xml:space="preserve">01 Executive Summary · 02 Design Document · 03 Implementation Guide · 04 User Guide · 05 Validation &amp; Testing Plan</w:t>
-      </w:r>
-      <w:r>
-        <w:t xml:space="preserve"> </w:t>
-      </w:r>
+        <w:t>buildMoveByADGroupInvocation</w:t>
+      </w:r>
+      <w:r>
+        <w:t>.</w:t>
+      </w:r>
+    </w:p>
+    <w:p>
+      <w:pPr>
+        <w:pStyle w:val="Compact"/>
+        <w:numPr>
+          <w:ilvl w:val="0"/>
+          <w:numId w:val="2"/>
+        </w:numPr>
+      </w:pPr>
+      <w:r>
+        <w:t xml:space="preserve">Reuse of shared components on a PowerShell (PS) host: </w:t>
+      </w:r>
+      <w:r>
+        <w:rPr>
+          <w:rStyle w:val="VerbatimChar"/>
+        </w:rPr>
+        <w:t>cvs_functions.ps1</w:t>
+      </w:r>
+      <w:r>
+        <w:t xml:space="preserve">, </w:t>
+      </w:r>
+      <w:r>
+        <w:rPr>
+          <w:rStyle w:val="VerbatimChar"/>
+        </w:rPr>
+        <w:t>parseScriptOutput</w:t>
+      </w:r>
+      <w:r>
+        <w:t xml:space="preserve">, </w:t>
+      </w:r>
+      <w:r>
+        <w:rPr>
+          <w:rStyle w:val="VerbatimChar"/>
+        </w:rPr>
+        <w:t>handlePSFailure</w:t>
+      </w:r>
+      <w:r>
+        <w:t xml:space="preserve">, and the OOTB </w:t>
+      </w:r>
+      <w:r>
+        <w:rPr>
+          <w:i/>
+          <w:iCs/>
+        </w:rPr>
+        <w:t>Invoke a PowerShell script</w:t>
+      </w:r>
+      <w:r>
+        <w:t xml:space="preserve"> workflow (documented in Shared-Components.docx).</w:t>
+      </w:r>
+    </w:p>
+    <w:p>
+      <w:pPr>
+        <w:pStyle w:val="FirstParagraph"/>
+      </w:pPr>
       <w:r>
         <w:rPr>
           <w:b/>
           <w:bCs/>
         </w:rPr>
-        <w:t xml:space="preserve">Shared references:</w:t>
-      </w:r>
-      <w:r>
-        <w:t xml:space="preserve"> </w:t>
-      </w:r>
-      <w:r>
-        <w:t xml:space="preserve">../../_Shared/Documentation/Shared-Components.docx · ../../_Shared/Documentation/Change-Register.docx · ../../_Shared/Documentation/Ansible-to-vRO-MappingTable.docx · "How to Build a PowerShell Host" (Automation Projects/_Shared References/PowerShell Host Build Guide/)</w:t>
+        <w:t>Out of scope</w:t>
       </w:r>
     </w:p>
     <w:p>
-      <w:r>
-        <w:pict>
-          <v:rect style="width:0;height:1.5pt" o:hralign="center" o:hrstd="t" o:hr="t"/>
-        </w:pict>
-      </w:r>
-    </w:p>
-    <w:bookmarkStart w:id="9" w:name="objective"/>
-    <w:p>
-      <w:pPr>
-        <w:pStyle w:val="Heading2"/>
-      </w:pPr>
-      <w:r>
-        <w:t xml:space="preserve">Objective</w:t>
+      <w:pPr>
+        <w:pStyle w:val="Compact"/>
+        <w:numPr>
+          <w:ilvl w:val="0"/>
+          <w:numId w:val="3"/>
+        </w:numPr>
+      </w:pPr>
+      <w:r>
+        <w:t>The archive-share cleanup workflow (a separate deliverable).</w:t>
       </w:r>
     </w:p>
     <w:p>
       <w:pPr>
-        <w:pStyle w:val="FirstParagraph"/>
-      </w:pPr>
-      <w:r>
-        <w:t xml:space="preserve">Replace the retiring Ansible automation that moves Windows event-log archives with one supported VCF Orchestrator workflow —</w:t>
-      </w:r>
-      <w:r>
-        <w:t xml:space="preserve"> </w:t>
-      </w:r>
+        <w:pStyle w:val="Compact"/>
+        <w:numPr>
+          <w:ilvl w:val="0"/>
+          <w:numId w:val="3"/>
+        </w:numPr>
+      </w:pPr>
+      <w:r>
+        <w:t>Per-server structured status reporting in Orchestrator (Phase 2).</w:t>
+      </w:r>
+    </w:p>
+    <w:p>
+      <w:pPr>
+        <w:pStyle w:val="Compact"/>
+        <w:numPr>
+          <w:ilvl w:val="0"/>
+          <w:numId w:val="3"/>
+        </w:numPr>
+      </w:pPr>
+      <w:r>
+        <w:t>Email reporting on completion (Phase 2).</w:t>
+      </w:r>
+    </w:p>
+    <w:p>
+      <w:pPr>
+        <w:pStyle w:val="Compact"/>
+        <w:numPr>
+          <w:ilvl w:val="0"/>
+          <w:numId w:val="3"/>
+        </w:numPr>
+      </w:pPr>
+      <w:r>
+        <w:t xml:space="preserve">Broader refactor/optimization of </w:t>
+      </w:r>
+      <w:r>
+        <w:rPr>
+          <w:rStyle w:val="VerbatimChar"/>
+        </w:rPr>
+        <w:t>cvs_functions.ps1</w:t>
+      </w:r>
+      <w:r>
+        <w:t>.</w:t>
+      </w:r>
+    </w:p>
+    <w:p>
+      <w:pPr>
+        <w:pStyle w:val="Compact"/>
+        <w:numPr>
+          <w:ilvl w:val="0"/>
+          <w:numId w:val="3"/>
+        </w:numPr>
+      </w:pPr>
+      <w:r>
+        <w:t>Provisioning of the archive file share and AD groups (customer prerequisites).</w:t>
+      </w:r>
+    </w:p>
+    <w:p>
+      <w:pPr>
+        <w:pStyle w:val="Heading2"/>
+      </w:pPr>
+      <w:bookmarkStart w:id="3" w:name="key-benefits"/>
+      <w:bookmarkEnd w:id="2"/>
+      <w:r>
+        <w:t>Key benefits</w:t>
+      </w:r>
+    </w:p>
+    <w:p>
+      <w:pPr>
+        <w:pStyle w:val="Compact"/>
+        <w:numPr>
+          <w:ilvl w:val="0"/>
+          <w:numId w:val="4"/>
+        </w:numPr>
+      </w:pPr>
       <w:r>
         <w:rPr>
           <w:b/>
           <w:bCs/>
         </w:rPr>
-        <w:t xml:space="preserve">Move-ArchivedLogs-ByADGroup</w:t>
-      </w:r>
-      <w:r>
-        <w:t xml:space="preserve"> </w:t>
-      </w:r>
-      <w:r>
-        <w:t xml:space="preserve">— reusing the proven</w:t>
-      </w:r>
-      <w:r>
-        <w:t xml:space="preserve"> </w:t>
-      </w:r>
-      <w:r>
-        <w:rPr>
-          <w:rStyle w:val="VerbatimChar"/>
-        </w:rPr>
-        <w:t xml:space="preserve">cvs_functions.ps1</w:t>
-      </w:r>
-      <w:r>
-        <w:t xml:space="preserve"> </w:t>
-      </w:r>
-      <w:r>
-        <w:t xml:space="preserve">PowerShell logic rather than rewriting it.</w:t>
-      </w:r>
-    </w:p>
-    <w:p>
-      <w:pPr>
-        <w:pStyle w:val="BodyText"/>
-      </w:pPr>
-      <w:r>
-        <w:t xml:space="preserve">Business outcome: automated offload of Windows</w:t>
-      </w:r>
-      <w:r>
-        <w:t xml:space="preserve"> </w:t>
-      </w:r>
-      <w:r>
-        <w:rPr>
-          <w:rStyle w:val="VerbatimChar"/>
-        </w:rPr>
-        <w:t xml:space="preserve">Archive-*.evtx</w:t>
-      </w:r>
-      <w:r>
-        <w:t xml:space="preserve"> </w:t>
-      </w:r>
-      <w:r>
-        <w:t xml:space="preserve">logs continues uninterrupted after Ansible is decommissioned, on a platform the customer already owns.</w:t>
-      </w:r>
-    </w:p>
-    <w:bookmarkEnd w:id="9"/>
-    <w:bookmarkStart w:id="10" w:name="scope"/>
-    <w:p>
-      <w:pPr>
-        <w:pStyle w:val="Heading2"/>
-      </w:pPr>
-      <w:r>
-        <w:t xml:space="preserve">Scope</w:t>
-      </w:r>
-    </w:p>
-    <w:p>
-      <w:pPr>
-        <w:pStyle w:val="FirstParagraph"/>
-      </w:pPr>
+        <w:t>Consolidation:</w:t>
+      </w:r>
+      <w:r>
+        <w:t xml:space="preserve"> the former local-execution and three near-duplicate AD-targeting variants collapse into </w:t>
+      </w:r>
       <w:r>
         <w:rPr>
           <w:b/>
           <w:bCs/>
         </w:rPr>
-        <w:t xml:space="preserve">In scope</w:t>
+        <w:t>one</w:t>
+      </w:r>
+      <w:r>
+        <w:t xml:space="preserve"> recursive, enabled-only method (</w:t>
+      </w:r>
+      <w:r>
+        <w:rPr>
+          <w:rStyle w:val="VerbatimChar"/>
+        </w:rPr>
+        <w:t>Get-ListOfServers-ByCN</w:t>
+      </w:r>
+      <w:r>
+        <w:t>).</w:t>
       </w:r>
     </w:p>
     <w:p>
@@ -214,83 +339,47 @@
         <w:pStyle w:val="Compact"/>
         <w:numPr>
           <w:ilvl w:val="0"/>
-          <w:numId w:val="1001"/>
+          <w:numId w:val="4"/>
         </w:numPr>
       </w:pPr>
-      <w:r>
-        <w:t xml:space="preserve">One Orchestrator workflow:</w:t>
-      </w:r>
-      <w:r>
-        <w:t xml:space="preserve"> </w:t>
-      </w:r>
       <w:r>
         <w:rPr>
           <w:b/>
           <w:bCs/>
         </w:rPr>
-        <w:t xml:space="preserve">Move-ArchivedLogs-ByADGroup</w:t>
-      </w:r>
-      <w:r>
-        <w:t xml:space="preserve"> </w:t>
-      </w:r>
-      <w:r>
-        <w:t xml:space="preserve">— move</w:t>
-      </w:r>
-      <w:r>
-        <w:t xml:space="preserve"> </w:t>
-      </w:r>
-      <w:r>
-        <w:rPr>
-          <w:rStyle w:val="VerbatimChar"/>
-        </w:rPr>
-        <w:t xml:space="preserve">Archive-*.evtx</w:t>
-      </w:r>
-      <w:r>
-        <w:t xml:space="preserve"> </w:t>
-      </w:r>
-      <w:r>
-        <w:t xml:space="preserve">off every</w:t>
-      </w:r>
-      <w:r>
-        <w:t xml:space="preserve"> </w:t>
-      </w:r>
+        <w:t>Operator-driven and parameterized:</w:t>
+      </w:r>
+      <w:r>
+        <w:t xml:space="preserve"> domain, group (DN), script path, file-share target, file filter, and file age are all workflow inputs, with defaults set directly on each input.</w:t>
+      </w:r>
+    </w:p>
+    <w:p>
+      <w:pPr>
+        <w:pStyle w:val="Compact"/>
+        <w:numPr>
+          <w:ilvl w:val="0"/>
+          <w:numId w:val="4"/>
+        </w:numPr>
+      </w:pPr>
       <w:r>
         <w:rPr>
           <w:b/>
           <w:bCs/>
         </w:rPr>
-        <w:t xml:space="preserve">enabled</w:t>
-      </w:r>
-      <w:r>
-        <w:t xml:space="preserve"> </w:t>
-      </w:r>
-      <w:r>
-        <w:t xml:space="preserve">member of an AD group to a central archive share, into a per-server subfolder.</w:t>
-      </w:r>
-    </w:p>
-    <w:p>
-      <w:pPr>
-        <w:pStyle w:val="Compact"/>
-        <w:numPr>
-          <w:ilvl w:val="0"/>
-          <w:numId w:val="1001"/>
-        </w:numPr>
-      </w:pPr>
-      <w:r>
-        <w:t xml:space="preserve">The deliverable-specific action</w:t>
-      </w:r>
-      <w:r>
-        <w:t xml:space="preserve"> </w:t>
+        <w:t>Resilient by design:</w:t>
+      </w:r>
+      <w:r>
+        <w:t xml:space="preserve"> disabled members are skipped and logged; an enabled-but-unreachable member is logged and skipped while the remaining moves continue; only a failure that would break </w:t>
       </w:r>
       <w:r>
         <w:rPr>
           <w:b/>
           <w:bCs/>
         </w:rPr>
-        <w:t xml:space="preserve">buildMoveByADGroupInvocation</w:t>
-      </w:r>
-      <w:r>
-        <w:t xml:space="preserve">.</w:t>
+        <w:t>every</w:t>
+      </w:r>
+      <w:r>
+        <w:t xml:space="preserve"> move fails the run.</w:t>
       </w:r>
     </w:p>
     <w:p>
@@ -298,350 +387,92 @@
         <w:pStyle w:val="Compact"/>
         <w:numPr>
           <w:ilvl w:val="0"/>
-          <w:numId w:val="1001"/>
+          <w:numId w:val="4"/>
         </w:numPr>
-      </w:pPr>
-      <w:r>
-        <w:t xml:space="preserve">Reuse of shared components on a PowerShell (PS) host:</w:t>
-      </w:r>
-      <w:r>
-        <w:t xml:space="preserve"> </w:t>
-      </w:r>
-      <w:r>
-        <w:rPr>
-          <w:rStyle w:val="VerbatimChar"/>
-        </w:rPr>
-        <w:t xml:space="preserve">cvs_functions.ps1</w:t>
-      </w:r>
-      <w:r>
-        <w:t xml:space="preserve">,</w:t>
-      </w:r>
-      <w:r>
-        <w:t xml:space="preserve"> </w:t>
-      </w:r>
-      <w:r>
-        <w:rPr>
-          <w:rStyle w:val="VerbatimChar"/>
-        </w:rPr>
-        <w:t xml:space="preserve">parseScriptOutput</w:t>
-      </w:r>
-      <w:r>
-        <w:t xml:space="preserve">,</w:t>
-      </w:r>
-      <w:r>
-        <w:t xml:space="preserve"> </w:t>
-      </w:r>
-      <w:r>
-        <w:rPr>
-          <w:rStyle w:val="VerbatimChar"/>
-        </w:rPr>
-        <w:t xml:space="preserve">handlePSFailure</w:t>
-      </w:r>
-      <w:r>
-        <w:t xml:space="preserve">, and the OOTB</w:t>
-      </w:r>
-      <w:r>
-        <w:t xml:space="preserve"> </w:t>
-      </w:r>
-      <w:r>
-        <w:rPr>
-          <w:i/>
-          <w:iCs/>
-        </w:rPr>
-        <w:t xml:space="preserve">Invoke a PowerShell script</w:t>
-      </w:r>
-      <w:r>
-        <w:t xml:space="preserve"> </w:t>
-      </w:r>
-      <w:r>
-        <w:t xml:space="preserve">workflow (documented in Shared-Components.docx).</w:t>
-      </w:r>
-    </w:p>
-    <w:p>
-      <w:pPr>
-        <w:pStyle w:val="FirstParagraph"/>
       </w:pPr>
       <w:r>
         <w:rPr>
           <w:b/>
           <w:bCs/>
         </w:rPr>
-        <w:t xml:space="preserve">Out of scope</w:t>
+        <w:lastRenderedPageBreak/>
+        <w:t>Standardized:</w:t>
+      </w:r>
+      <w:r>
+        <w:t xml:space="preserve"> one code path for all hosts — the PS host itself is handled as an ordinary AD-group member, eliminating the former "local execution" special case.</w:t>
       </w:r>
     </w:p>
     <w:p>
       <w:pPr>
-        <w:pStyle w:val="Compact"/>
-        <w:numPr>
-          <w:ilvl w:val="0"/>
-          <w:numId w:val="1002"/>
-        </w:numPr>
-      </w:pPr>
-      <w:r>
-        <w:t xml:space="preserve">The archive-share cleanup workflow (a separate deliverable).</w:t>
-      </w:r>
-    </w:p>
-    <w:p>
-      <w:pPr>
-        <w:pStyle w:val="Compact"/>
-        <w:numPr>
-          <w:ilvl w:val="0"/>
-          <w:numId w:val="1002"/>
-        </w:numPr>
-      </w:pPr>
-      <w:r>
-        <w:t xml:space="preserve">Per-server structured status reporting in Orchestrator (Phase 2).</w:t>
-      </w:r>
-    </w:p>
-    <w:p>
-      <w:pPr>
-        <w:pStyle w:val="Compact"/>
-        <w:numPr>
-          <w:ilvl w:val="0"/>
-          <w:numId w:val="1002"/>
-        </w:numPr>
-      </w:pPr>
-      <w:r>
-        <w:t xml:space="preserve">Email reporting on completion (Phase 2).</w:t>
-      </w:r>
-    </w:p>
-    <w:p>
-      <w:pPr>
-        <w:pStyle w:val="Compact"/>
-        <w:numPr>
-          <w:ilvl w:val="0"/>
-          <w:numId w:val="1002"/>
-        </w:numPr>
-      </w:pPr>
-      <w:r>
-        <w:t xml:space="preserve">Broader refactor/optimization of</w:t>
-      </w:r>
-      <w:r>
-        <w:t xml:space="preserve"> </w:t>
-      </w:r>
-      <w:r>
-        <w:rPr>
-          <w:rStyle w:val="VerbatimChar"/>
-        </w:rPr>
-        <w:t xml:space="preserve">cvs_functions.ps1</w:t>
-      </w:r>
-      <w:r>
-        <w:t xml:space="preserve">.</w:t>
-      </w:r>
-    </w:p>
-    <w:p>
-      <w:pPr>
-        <w:pStyle w:val="Compact"/>
-        <w:numPr>
-          <w:ilvl w:val="0"/>
-          <w:numId w:val="1002"/>
-        </w:numPr>
-      </w:pPr>
-      <w:r>
-        <w:t xml:space="preserve">Provisioning of the archive file share and AD groups (customer prerequisites).</w:t>
-      </w:r>
-    </w:p>
-    <w:bookmarkEnd w:id="10"/>
-    <w:bookmarkStart w:id="11" w:name="key-benefits"/>
-    <w:p>
-      <w:pPr>
         <w:pStyle w:val="Heading2"/>
       </w:pPr>
-      <w:r>
-        <w:t xml:space="preserve">Key benefits</w:t>
-      </w:r>
-    </w:p>
-    <w:p>
-      <w:pPr>
-        <w:pStyle w:val="Compact"/>
-        <w:numPr>
-          <w:ilvl w:val="0"/>
-          <w:numId w:val="1003"/>
-        </w:numPr>
-      </w:pPr>
-      <w:r>
-        <w:rPr>
-          <w:b/>
-          <w:bCs/>
-        </w:rPr>
-        <w:t xml:space="preserve">Consolidation:</w:t>
-      </w:r>
-      <w:r>
-        <w:t xml:space="preserve"> </w:t>
-      </w:r>
-      <w:r>
-        <w:t xml:space="preserve">the former local-execution and three near-duplicate AD-targeting variants collapse into</w:t>
-      </w:r>
-      <w:r>
-        <w:t xml:space="preserve"> </w:t>
-      </w:r>
-      <w:r>
-        <w:rPr>
-          <w:b/>
-          <w:bCs/>
-        </w:rPr>
-        <w:t xml:space="preserve">one</w:t>
-      </w:r>
-      <w:r>
-        <w:t xml:space="preserve"> </w:t>
-      </w:r>
-      <w:r>
-        <w:t xml:space="preserve">recursive, enabled-only method (</w:t>
-      </w:r>
-      <w:r>
-        <w:rPr>
-          <w:rStyle w:val="VerbatimChar"/>
-        </w:rPr>
-        <w:t xml:space="preserve">Get-ListOfServers-ByCN</w:t>
-      </w:r>
-      <w:r>
-        <w:t xml:space="preserve">).</w:t>
-      </w:r>
-    </w:p>
-    <w:p>
-      <w:pPr>
-        <w:pStyle w:val="Compact"/>
-        <w:numPr>
-          <w:ilvl w:val="0"/>
-          <w:numId w:val="1003"/>
-        </w:numPr>
-      </w:pPr>
-      <w:r>
-        <w:rPr>
-          <w:b/>
-          <w:bCs/>
-        </w:rPr>
-        <w:t xml:space="preserve">Operator-driven and parameterized:</w:t>
-      </w:r>
-      <w:r>
-        <w:t xml:space="preserve"> </w:t>
-      </w:r>
-      <w:r>
-        <w:t xml:space="preserve">domain, group (DN), script path, file-share target, file filter, and file age are all workflow inputs, with defaults set directly on each input.</w:t>
-      </w:r>
-    </w:p>
-    <w:p>
-      <w:pPr>
-        <w:pStyle w:val="Compact"/>
-        <w:numPr>
-          <w:ilvl w:val="0"/>
-          <w:numId w:val="1003"/>
-        </w:numPr>
-      </w:pPr>
-      <w:r>
-        <w:rPr>
-          <w:b/>
-          <w:bCs/>
-        </w:rPr>
-        <w:t xml:space="preserve">Resilient by design:</w:t>
-      </w:r>
-      <w:r>
-        <w:t xml:space="preserve"> </w:t>
-      </w:r>
-      <w:r>
-        <w:t xml:space="preserve">disabled members are skipped and logged; an enabled-but-unreachable member is logged and skipped while the remaining moves continue; only a failure that would break</w:t>
-      </w:r>
-      <w:r>
-        <w:t xml:space="preserve"> </w:t>
-      </w:r>
-      <w:r>
-        <w:rPr>
-          <w:b/>
-          <w:bCs/>
-        </w:rPr>
-        <w:t xml:space="preserve">every</w:t>
-      </w:r>
-      <w:r>
-        <w:t xml:space="preserve"> </w:t>
-      </w:r>
-      <w:r>
-        <w:t xml:space="preserve">move fails the run.</w:t>
-      </w:r>
-    </w:p>
-    <w:p>
-      <w:pPr>
-        <w:pStyle w:val="Compact"/>
-        <w:numPr>
-          <w:ilvl w:val="0"/>
-          <w:numId w:val="1003"/>
-        </w:numPr>
-      </w:pPr>
-      <w:r>
-        <w:rPr>
-          <w:b/>
-          <w:bCs/>
-        </w:rPr>
-        <w:t xml:space="preserve">Standardized:</w:t>
-      </w:r>
-      <w:r>
-        <w:t xml:space="preserve"> </w:t>
-      </w:r>
-      <w:r>
-        <w:t xml:space="preserve">one code path for all hosts — the PS host itself is handled as an ordinary AD-group member, eliminating the former "local execution" special case.</w:t>
-      </w:r>
-    </w:p>
-    <w:bookmarkEnd w:id="11"/>
-    <w:bookmarkStart w:id="12" w:name="key-risks"/>
-    <w:p>
-      <w:pPr>
-        <w:pStyle w:val="Heading2"/>
-      </w:pPr>
-      <w:r>
-        <w:t xml:space="preserve">Key risks</w:t>
+      <w:bookmarkStart w:id="4" w:name="key-risks"/>
+      <w:bookmarkEnd w:id="3"/>
+      <w:r>
+        <w:t>Key risks</w:t>
       </w:r>
     </w:p>
     <w:tbl>
       <w:tblPr>
         <w:tblStyle w:val="Table"/>
-        <w:tblW w:type="auto" w:w="0"/>
-        <w:tblLook w:firstRow="1" w:lastRow="0" w:firstColumn="0" w:lastColumn="0" w:noHBand="0" w:noVBand="0" w:val="0020"/>
+        <w:tblW w:w="0" w:type="auto"/>
+        <w:tblLook w:val="0020" w:firstRow="1" w:lastRow="0" w:firstColumn="0" w:lastColumn="0" w:noHBand="0" w:noVBand="0"/>
       </w:tblPr>
       <w:tblGrid>
-        <w:gridCol w:w="2640"/>
-        <w:gridCol w:w="2640"/>
-        <w:gridCol w:w="2640"/>
+        <w:gridCol w:w="3220"/>
+        <w:gridCol w:w="3080"/>
+        <w:gridCol w:w="3276"/>
       </w:tblGrid>
       <w:tr>
         <w:trPr>
-          <w:tblHeader w:val="on"/>
+          <w:cnfStyle w:val="100000000000" w:firstRow="1" w:lastRow="0" w:firstColumn="0" w:lastColumn="0" w:oddVBand="0" w:evenVBand="0" w:oddHBand="0" w:evenHBand="0" w:firstRowFirstColumn="0" w:firstRowLastColumn="0" w:lastRowFirstColumn="0" w:lastRowLastColumn="0"/>
+          <w:tblHeader/>
         </w:trPr>
         <w:tc>
-          <w:tcPr/>
+          <w:tcPr>
+            <w:tcW w:w="0" w:type="auto"/>
+          </w:tcPr>
           <w:p>
             <w:pPr>
               <w:pStyle w:val="Compact"/>
             </w:pPr>
             <w:r>
-              <w:t xml:space="preserve">Risk</w:t>
+              <w:t>Risk</w:t>
             </w:r>
           </w:p>
         </w:tc>
         <w:tc>
-          <w:tcPr/>
+          <w:tcPr>
+            <w:tcW w:w="0" w:type="auto"/>
+          </w:tcPr>
           <w:p>
             <w:pPr>
               <w:pStyle w:val="Compact"/>
             </w:pPr>
             <w:r>
-              <w:t xml:space="preserve">Impact</w:t>
+              <w:t>Impact</w:t>
             </w:r>
           </w:p>
         </w:tc>
         <w:tc>
-          <w:tcPr/>
+          <w:tcPr>
+            <w:tcW w:w="0" w:type="auto"/>
+          </w:tcPr>
           <w:p>
             <w:pPr>
               <w:pStyle w:val="Compact"/>
             </w:pPr>
             <w:r>
-              <w:t xml:space="preserve">Mitigation</w:t>
+              <w:t>Mitigation</w:t>
             </w:r>
           </w:p>
         </w:tc>
       </w:tr>
       <w:tr>
         <w:tc>
-          <w:tcPr/>
+          <w:tcPr>
+            <w:tcW w:w="0" w:type="auto"/>
+          </w:tcPr>
           <w:p>
             <w:pPr>
               <w:pStyle w:val="Compact"/>
@@ -651,88 +482,73 @@
                 <w:b/>
                 <w:bCs/>
               </w:rPr>
-              <w:t xml:space="preserve">Second-hop authentication</w:t>
-            </w:r>
-            <w:r>
-              <w:t xml:space="preserve"> </w:t>
-            </w:r>
-            <w:r>
-              <w:t xml:space="preserve">(PS host → remote</w:t>
-            </w:r>
-            <w:r>
-              <w:t xml:space="preserve"> </w:t>
+              <w:t>Second-hop authentication</w:t>
+            </w:r>
+            <w:r>
+              <w:t xml:space="preserve"> (PS host → remote </w:t>
             </w:r>
             <w:r>
               <w:rPr>
                 <w:rStyle w:val="VerbatimChar"/>
               </w:rPr>
-              <w:t xml:space="preserve">\\server\C$</w:t>
-            </w:r>
-            <w:r>
-              <w:t xml:space="preserve"> </w:t>
-            </w:r>
-            <w:r>
-              <w:t xml:space="preserve">source and</w:t>
-            </w:r>
-            <w:r>
-              <w:t xml:space="preserve"> </w:t>
+              <w:t>\\server\C$</w:t>
+            </w:r>
+            <w:r>
+              <w:t xml:space="preserve"> source and </w:t>
             </w:r>
             <w:r>
               <w:rPr>
                 <w:rStyle w:val="VerbatimChar"/>
               </w:rPr>
-              <w:t xml:space="preserve">\\fileshare</w:t>
-            </w:r>
-            <w:r>
-              <w:t xml:space="preserve"> </w:t>
-            </w:r>
-            <w:r>
-              <w:t xml:space="preserve">destination)</w:t>
+              <w:t>\\fileshare</w:t>
+            </w:r>
+            <w:r>
+              <w:t xml:space="preserve"> destination)</w:t>
             </w:r>
           </w:p>
         </w:tc>
         <w:tc>
-          <w:tcPr/>
+          <w:tcPr>
+            <w:tcW w:w="0" w:type="auto"/>
+          </w:tcPr>
           <w:p>
             <w:pPr>
               <w:pStyle w:val="Compact"/>
             </w:pPr>
             <w:r>
-              <w:t xml:space="preserve">Move fails access-denied if the credential cannot be delegated</w:t>
+              <w:t>Move fails access-denied if the credential cannot be delegated</w:t>
             </w:r>
           </w:p>
         </w:tc>
         <w:tc>
-          <w:tcPr/>
+          <w:tcPr>
+            <w:tcW w:w="0" w:type="auto"/>
+          </w:tcPr>
           <w:p>
             <w:pPr>
               <w:pStyle w:val="Compact"/>
             </w:pPr>
             <w:r>
-              <w:t xml:space="preserve">Kerberos + constrained delegation (production) or Basic-over-HTTPS (lab);</w:t>
-            </w:r>
-            <w:r>
-              <w:t xml:space="preserve"> </w:t>
+              <w:t xml:space="preserve">Kerberos + constrained delegation (production) or Basic-over-HTTPS (lab); </w:t>
             </w:r>
             <w:r>
               <w:rPr>
                 <w:b/>
                 <w:bCs/>
               </w:rPr>
-              <w:t xml:space="preserve">validate the hop before go-live</w:t>
-            </w:r>
-            <w:r>
-              <w:t xml:space="preserve"> </w:t>
-            </w:r>
-            <w:r>
-              <w:t xml:space="preserve">(Implementation Guide)</w:t>
+              <w:t>validate the hop before go-live</w:t>
+            </w:r>
+            <w:r>
+              <w:t xml:space="preserve"> (Implementation Guide)</w:t>
             </w:r>
           </w:p>
         </w:tc>
       </w:tr>
       <w:tr>
         <w:tc>
-          <w:tcPr/>
+          <w:tcPr>
+            <w:tcW w:w="0" w:type="auto"/>
+          </w:tcPr>
           <w:p>
             <w:pPr>
               <w:pStyle w:val="Compact"/>
@@ -742,63 +558,60 @@
                 <w:b/>
                 <w:bCs/>
               </w:rPr>
-              <w:t xml:space="preserve">AD "enabled" ≠ host reachable</w:t>
+              <w:t>AD "enabled" ≠ host reachable</w:t>
             </w:r>
           </w:p>
         </w:tc>
         <w:tc>
-          <w:tcPr/>
+          <w:tcPr>
+            <w:tcW w:w="0" w:type="auto"/>
+          </w:tcPr>
           <w:p>
             <w:pPr>
               <w:pStyle w:val="Compact"/>
             </w:pPr>
             <w:r>
-              <w:t xml:space="preserve">An enabled-but-offline computer object (e.g.</w:t>
-            </w:r>
-            <w:r>
-              <w:t xml:space="preserve"> </w:t>
+              <w:t xml:space="preserve">An enabled-but-offline computer object (e.g. </w:t>
             </w:r>
             <w:r>
               <w:rPr>
                 <w:rStyle w:val="VerbatimChar"/>
               </w:rPr>
-              <w:t xml:space="preserve">disabledsrv01</w:t>
-            </w:r>
-            <w:r>
-              <w:t xml:space="preserve">) is still processed and errors</w:t>
+              <w:t>disabledsrv01</w:t>
+            </w:r>
+            <w:r>
+              <w:t>) is still processed and errors</w:t>
             </w:r>
           </w:p>
         </w:tc>
         <w:tc>
-          <w:tcPr/>
+          <w:tcPr>
+            <w:tcW w:w="0" w:type="auto"/>
+          </w:tcPr>
           <w:p>
             <w:pPr>
               <w:pStyle w:val="Compact"/>
             </w:pPr>
             <w:r>
-              <w:t xml:space="preserve">To exclude a host,</w:t>
-            </w:r>
-            <w:r>
-              <w:t xml:space="preserve"> </w:t>
+              <w:t xml:space="preserve">To exclude a host, </w:t>
             </w:r>
             <w:r>
               <w:rPr>
                 <w:rStyle w:val="VerbatimChar"/>
               </w:rPr>
-              <w:t xml:space="preserve">Disable-ADAccount</w:t>
-            </w:r>
-            <w:r>
-              <w:t xml:space="preserve"> </w:t>
-            </w:r>
-            <w:r>
-              <w:t xml:space="preserve">it or remove it from the group</w:t>
+              <w:t>Disable-ADAccount</w:t>
+            </w:r>
+            <w:r>
+              <w:t xml:space="preserve"> it or remove it from the group</w:t>
             </w:r>
           </w:p>
         </w:tc>
       </w:tr>
       <w:tr>
         <w:tc>
-          <w:tcPr/>
+          <w:tcPr>
+            <w:tcW w:w="0" w:type="auto"/>
+          </w:tcPr>
           <w:p>
             <w:pPr>
               <w:pStyle w:val="Compact"/>
@@ -808,42 +621,45 @@
                 <w:b/>
                 <w:bCs/>
               </w:rPr>
-              <w:t xml:space="preserve">RSAT ActiveDirectory module missing</w:t>
-            </w:r>
-            <w:r>
-              <w:t xml:space="preserve"> </w:t>
-            </w:r>
-            <w:r>
-              <w:t xml:space="preserve">on the PS host</w:t>
+              <w:t>RSAT ActiveDirectory module missing</w:t>
+            </w:r>
+            <w:r>
+              <w:t xml:space="preserve"> on the PS host</w:t>
             </w:r>
           </w:p>
         </w:tc>
         <w:tc>
-          <w:tcPr/>
+          <w:tcPr>
+            <w:tcW w:w="0" w:type="auto"/>
+          </w:tcPr>
           <w:p>
             <w:pPr>
               <w:pStyle w:val="Compact"/>
             </w:pPr>
             <w:r>
-              <w:t xml:space="preserve">AD resolution fails; run terminates (Failed: PS Execution)</w:t>
+              <w:t>AD resolution fails; run terminates (Failed: PS Execution)</w:t>
             </w:r>
           </w:p>
         </w:tc>
         <w:tc>
-          <w:tcPr/>
+          <w:tcPr>
+            <w:tcW w:w="0" w:type="auto"/>
+          </w:tcPr>
           <w:p>
             <w:pPr>
               <w:pStyle w:val="Compact"/>
             </w:pPr>
             <w:r>
-              <w:t xml:space="preserve">Install RSAT AD tools on the PS host before go-live (see PS-Host guide)</w:t>
+              <w:t>Install RSAT AD tools on the PS host before go-live (see PS-Host guide)</w:t>
             </w:r>
           </w:p>
         </w:tc>
       </w:tr>
       <w:tr>
         <w:tc>
-          <w:tcPr/>
+          <w:tcPr>
+            <w:tcW w:w="0" w:type="auto"/>
+          </w:tcPr>
           <w:p>
             <w:pPr>
               <w:pStyle w:val="Compact"/>
@@ -853,51 +669,51 @@
                 <w:b/>
                 <w:bCs/>
               </w:rPr>
-              <w:t xml:space="preserve">Script version drift</w:t>
+              <w:t>Script version drift</w:t>
             </w:r>
           </w:p>
         </w:tc>
         <w:tc>
-          <w:tcPr/>
+          <w:tcPr>
+            <w:tcW w:w="0" w:type="auto"/>
+          </w:tcPr>
           <w:p>
             <w:pPr>
               <w:pStyle w:val="Compact"/>
             </w:pPr>
             <w:r>
-              <w:t xml:space="preserve">Behavior depends on the updated</w:t>
-            </w:r>
-            <w:r>
-              <w:t xml:space="preserve"> </w:t>
+              <w:t xml:space="preserve">Behavior depends on the updated </w:t>
             </w:r>
             <w:r>
               <w:rPr>
                 <w:rStyle w:val="VerbatimChar"/>
               </w:rPr>
-              <w:t xml:space="preserve">cvs_functions.ps1</w:t>
-            </w:r>
-            <w:r>
-              <w:t xml:space="preserve"> </w:t>
-            </w:r>
-            <w:r>
-              <w:t xml:space="preserve">(changes S-1…S-5)</w:t>
+              <w:t>cvs_functions.ps1</w:t>
+            </w:r>
+            <w:r>
+              <w:t xml:space="preserve"> (changes S-1…S-5)</w:t>
             </w:r>
           </w:p>
         </w:tc>
         <w:tc>
-          <w:tcPr/>
+          <w:tcPr>
+            <w:tcW w:w="0" w:type="auto"/>
+          </w:tcPr>
           <w:p>
             <w:pPr>
               <w:pStyle w:val="Compact"/>
             </w:pPr>
             <w:r>
-              <w:t xml:space="preserve">Deploy/verify the updated script first (Change-Register, shared)</w:t>
+              <w:t>Deploy/verify the updated script first (Change-Register, shared)</w:t>
             </w:r>
           </w:p>
         </w:tc>
       </w:tr>
       <w:tr>
         <w:tc>
-          <w:tcPr/>
+          <w:tcPr>
+            <w:tcW w:w="0" w:type="auto"/>
+          </w:tcPr>
           <w:p>
             <w:pPr>
               <w:pStyle w:val="Compact"/>
@@ -907,51 +723,52 @@
                 <w:b/>
                 <w:bCs/>
               </w:rPr>
-              <w:t xml:space="preserve">Certificate trust &amp; Kerberos setup</w:t>
+              <w:t>Certificate trust &amp; Kerberos setup</w:t>
             </w:r>
           </w:p>
         </w:tc>
         <w:tc>
-          <w:tcPr/>
+          <w:tcPr>
+            <w:tcW w:w="0" w:type="auto"/>
+          </w:tcPr>
           <w:p>
             <w:pPr>
               <w:pStyle w:val="Compact"/>
             </w:pPr>
             <w:r>
-              <w:t xml:space="preserve">Host registration fails on untrusted cert or misconfigured</w:t>
-            </w:r>
-            <w:r>
-              <w:t xml:space="preserve"> </w:t>
+              <w:t xml:space="preserve">Host registration fails on untrusted cert or misconfigured </w:t>
             </w:r>
             <w:r>
               <w:rPr>
                 <w:rStyle w:val="VerbatimChar"/>
               </w:rPr>
-              <w:t xml:space="preserve">krb5.conf</w:t>
+              <w:t>krb5.conf</w:t>
             </w:r>
           </w:p>
         </w:tc>
         <w:tc>
-          <w:tcPr/>
+          <w:tcPr>
+            <w:tcW w:w="0" w:type="auto"/>
+          </w:tcPr>
           <w:p>
             <w:pPr>
               <w:pStyle w:val="Compact"/>
             </w:pPr>
             <w:r>
-              <w:t xml:space="preserve">Import cert to Orchestrator trust store; follow the PS-Host guide for Kerberos</w:t>
+              <w:t>Import cert to Orchestrator trust store; follow the PS-Host guide for Kerberos</w:t>
             </w:r>
           </w:p>
         </w:tc>
       </w:tr>
     </w:tbl>
-    <w:bookmarkEnd w:id="12"/>
-    <w:bookmarkStart w:id="13" w:name="high-level-approach"/>
     <w:p>
       <w:pPr>
         <w:pStyle w:val="Heading2"/>
       </w:pPr>
-      <w:r>
-        <w:t xml:space="preserve">High-level approach</w:t>
+      <w:bookmarkStart w:id="5" w:name="high-level-approach"/>
+      <w:bookmarkEnd w:id="4"/>
+      <w:r>
+        <w:t>High-level approach</w:t>
       </w:r>
     </w:p>
     <w:p>
@@ -959,11 +776,11 @@
         <w:pStyle w:val="Compact"/>
         <w:numPr>
           <w:ilvl w:val="0"/>
-          <w:numId w:val="1004"/>
+          <w:numId w:val="5"/>
         </w:numPr>
       </w:pPr>
       <w:r>
-        <w:t xml:space="preserve">Build/register the PS host (RSAT AD tools, WinRM HTTPS 5986, cert, auth) — shared "How to Build a PowerShell Host" guide.</w:t>
+        <w:t>Build/register the PS host (RSAT AD tools, WinRM HTTPS 5986, cert, auth) — shared "How to Build a PowerShell Host" guide.</w:t>
       </w:r>
     </w:p>
     <w:p>
@@ -971,26 +788,20 @@
         <w:pStyle w:val="Compact"/>
         <w:numPr>
           <w:ilvl w:val="0"/>
-          <w:numId w:val="1004"/>
+          <w:numId w:val="5"/>
         </w:numPr>
       </w:pPr>
       <w:r>
-        <w:t xml:space="preserve">Deploy the updated</w:t>
-      </w:r>
-      <w:r>
-        <w:t xml:space="preserve"> </w:t>
+        <w:t xml:space="preserve">Deploy the updated </w:t>
       </w:r>
       <w:r>
         <w:rPr>
           <w:rStyle w:val="VerbatimChar"/>
         </w:rPr>
-        <w:t xml:space="preserve">cvs_functions.ps1</w:t>
-      </w:r>
-      <w:r>
-        <w:t xml:space="preserve"> </w:t>
-      </w:r>
-      <w:r>
-        <w:t xml:space="preserve">to the PS host.</w:t>
+        <w:t>cvs_functions.ps1</w:t>
+      </w:r>
+      <w:r>
+        <w:t xml:space="preserve"> to the PS host.</w:t>
       </w:r>
     </w:p>
     <w:p>
@@ -998,53 +809,38 @@
         <w:pStyle w:val="Compact"/>
         <w:numPr>
           <w:ilvl w:val="0"/>
-          <w:numId w:val="1004"/>
+          <w:numId w:val="5"/>
         </w:numPr>
       </w:pPr>
       <w:r>
-        <w:t xml:space="preserve">Import the</w:t>
-      </w:r>
-      <w:r>
-        <w:t xml:space="preserve"> </w:t>
+        <w:t xml:space="preserve">Import the </w:t>
       </w:r>
       <w:r>
         <w:rPr>
           <w:rStyle w:val="VerbatimChar"/>
         </w:rPr>
-        <w:t xml:space="preserve">buildMoveByADGroupInvocation</w:t>
-      </w:r>
-      <w:r>
-        <w:t xml:space="preserve"> </w:t>
-      </w:r>
-      <w:r>
-        <w:t xml:space="preserve">action, the shared</w:t>
-      </w:r>
-      <w:r>
-        <w:t xml:space="preserve"> </w:t>
+        <w:t>buildMoveByADGroupInvocation</w:t>
+      </w:r>
+      <w:r>
+        <w:t xml:space="preserve"> action, the shared </w:t>
       </w:r>
       <w:r>
         <w:rPr>
           <w:rStyle w:val="VerbatimChar"/>
         </w:rPr>
-        <w:t xml:space="preserve">parseScriptOutput</w:t>
-      </w:r>
-      <w:r>
-        <w:t xml:space="preserve"> </w:t>
-      </w:r>
-      <w:r>
-        <w:t xml:space="preserve">action, and build the Move workflow per its</w:t>
-      </w:r>
-      <w:r>
-        <w:t xml:space="preserve"> </w:t>
+        <w:t>parseScriptOutput</w:t>
+      </w:r>
+      <w:r>
+        <w:t xml:space="preserve"> action, and build the Move workflow per its </w:t>
       </w:r>
       <w:r>
         <w:rPr>
           <w:rStyle w:val="VerbatimChar"/>
         </w:rPr>
-        <w:t xml:space="preserve">_spec.js</w:t>
-      </w:r>
-      <w:r>
-        <w:t xml:space="preserve">.</w:t>
+        <w:t>_spec.js</w:t>
+      </w:r>
+      <w:r>
+        <w:t>.</w:t>
       </w:r>
     </w:p>
     <w:p>
@@ -1052,11 +848,11 @@
         <w:pStyle w:val="Compact"/>
         <w:numPr>
           <w:ilvl w:val="0"/>
-          <w:numId w:val="1004"/>
+          <w:numId w:val="5"/>
         </w:numPr>
       </w:pPr>
       <w:r>
-        <w:t xml:space="preserve">Validate end to end — including the second-hop file access — then operate via the workflow custom form (on demand or scheduled).</w:t>
+        <w:t>Validate end to end — including the second-hop file access — then operate via the workflow custom form (on demand or scheduled).</w:t>
       </w:r>
     </w:p>
     <w:p>
@@ -1068,54 +864,32 @@
           <w:b/>
           <w:bCs/>
         </w:rPr>
-        <w:t xml:space="preserve">Recommendation:</w:t>
-      </w:r>
-      <w:r>
-        <w:t xml:space="preserve"> </w:t>
-      </w:r>
-      <w:r>
-        <w:t xml:space="preserve">validate in a lab with Basic-over-HTTPS first, then adopt Kerberos + constrained delegation as the production-hardening step. The choice does not change the workflow design.</w:t>
-      </w:r>
+        <w:t>Recommendation:</w:t>
+      </w:r>
+      <w:r>
+        <w:t xml:space="preserve"> validate in a lab with Basic-over-HTTPS first, then adopt Kerberos + constrained delegation as the production-hardening step. The choice does not change the workflow design.</w:t>
+      </w:r>
+      <w:bookmarkEnd w:id="0"/>
+      <w:bookmarkEnd w:id="5"/>
     </w:p>
-    <w:bookmarkEnd w:id="13"/>
-    <w:bookmarkEnd w:id="14"/>
     <w:sectPr>
       <w:footnotePr>
         <w:numRestart w:val="eachSect"/>
       </w:footnotePr>
+      <w:pgSz w:w="12240" w:h="15840"/>
+      <w:pgMar w:top="1440" w:right="1440" w:bottom="1440" w:left="1440" w:header="720" w:footer="720" w:gutter="0"/>
+      <w:cols w:space="720"/>
     </w:sectPr>
   </w:body>
 </w:document>
 </file>
 
-<file path=word/comments.xml><?xml version="1.0" encoding="utf-8"?>
-<w:comments xmlns:w="http://schemas.openxmlformats.org/wordprocessingml/2006/main" xmlns:m="http://schemas.openxmlformats.org/officeDocument/2006/math" xmlns:r="http://schemas.openxmlformats.org/officeDocument/2006/relationships" xmlns:o="urn:schemas-microsoft-com:office:office" xmlns:v="urn:schemas-microsoft-com:vml" xmlns:w10="urn:schemas-microsoft-com:office:word" xmlns:a="http://schemas.openxmlformats.org/drawingml/2006/main" xmlns:pic="http://schemas.openxmlformats.org/drawingml/2006/picture" xmlns:wp="http://schemas.openxmlformats.org/drawingml/2006/wordprocessingDrawing"/>
-</file>
-
-<file path=word/footnotes.xml><?xml version="1.0" encoding="utf-8"?>
-<w:footnotes xmlns:w="http://schemas.openxmlformats.org/wordprocessingml/2006/main" xmlns:m="http://schemas.openxmlformats.org/officeDocument/2006/math" xmlns:r="http://schemas.openxmlformats.org/officeDocument/2006/relationships" xmlns:o="urn:schemas-microsoft-com:office:office" xmlns:v="urn:schemas-microsoft-com:vml" xmlns:w10="urn:schemas-microsoft-com:office:word" xmlns:a="http://schemas.openxmlformats.org/drawingml/2006/main" xmlns:pic="http://schemas.openxmlformats.org/drawingml/2006/picture" xmlns:wp="http://schemas.openxmlformats.org/drawingml/2006/wordprocessingDrawing">
-  <w:footnote w:type="continuationSeparator" w:id="0">
-    <w:p>
-      <w:r>
-        <w:continuationSeparator/>
-      </w:r>
-    </w:p>
-  </w:footnote>
-  <w:footnote w:type="separator" w:id="-1">
-    <w:p>
-      <w:r>
-        <w:separator/>
-      </w:r>
-    </w:p>
-  </w:footnote>
-</w:footnotes>
-</file>
-
 <file path=word/numbering.xml><?xml version="1.0" encoding="utf-8"?>
-<w:numbering xmlns:w="http://schemas.openxmlformats.org/wordprocessingml/2006/main">
-  <w:abstractNum w:abstractNumId="990">
+<w:numbering xmlns:wpc="http://schemas.microsoft.com/office/word/2010/wordprocessingCanvas" xmlns:cx="http://schemas.microsoft.com/office/drawing/2014/chartex" xmlns:cx1="http://schemas.microsoft.com/office/drawing/2015/9/8/chartex" xmlns:cx2="http://schemas.microsoft.com/office/drawing/2015/10/21/chartex" xmlns:cx3="http://schemas.microsoft.com/office/drawing/2016/5/9/chartex" xmlns:cx4="http://schemas.microsoft.com/office/drawing/2016/5/10/chartex" xmlns:cx5="http://schemas.microsoft.com/office/drawing/2016/5/11/chartex" xmlns:cx6="http://schemas.microsoft.com/office/drawing/2016/5/12/chartex" xmlns:cx7="http://schemas.microsoft.com/office/drawing/2016/5/13/chartex" xmlns:cx8="http://schemas.microsoft.com/office/drawing/2016/5/14/chartex" xmlns:mc="http://schemas.openxmlformats.org/markup-compatibility/2006" xmlns:aink="http://schemas.microsoft.com/office/drawing/2016/ink" xmlns:am3d="http://schemas.microsoft.com/office/drawing/2017/model3d" xmlns:o="urn:schemas-microsoft-com:office:office" xmlns:oel="http://schemas.microsoft.com/office/2019/extlst" xmlns:r="http://schemas.openxmlformats.org/officeDocument/2006/relationships" xmlns:m="http://schemas.openxmlformats.org/officeDocument/2006/math" xmlns:v="urn:schemas-microsoft-com:vml" xmlns:wp14="http://schemas.microsoft.com/office/word/2010/wordprocessingDrawing" xmlns:wp="http://schemas.openxmlformats.org/drawingml/2006/wordprocessingDrawing" xmlns:w10="urn:schemas-microsoft-com:office:word" xmlns:w="http://schemas.openxmlformats.org/wordprocessingml/2006/main" xmlns:w14="http://schemas.microsoft.com/office/word/2010/wordml" xmlns:w15="http://schemas.microsoft.com/office/word/2012/wordml" xmlns:w16cex="http://schemas.microsoft.com/office/word/2018/wordml/cex" xmlns:w16cid="http://schemas.microsoft.com/office/word/2016/wordml/cid" xmlns:w16="http://schemas.microsoft.com/office/word/2018/wordml" xmlns:w16du="http://schemas.microsoft.com/office/word/2023/wordml/word16du" xmlns:w16sdtdh="http://schemas.microsoft.com/office/word/2020/wordml/sdtdatahash" xmlns:w16sdtfl="http://schemas.microsoft.com/office/word/2024/wordml/sdtformatlock" xmlns:w16se="http://schemas.microsoft.com/office/word/2015/wordml/symex" xmlns:wpg="http://schemas.microsoft.com/office/word/2010/wordprocessingGroup" xmlns:wpi="http://schemas.microsoft.com/office/word/2010/wordprocessingInk" xmlns:wne="http://schemas.microsoft.com/office/word/2006/wordml" xmlns:wps="http://schemas.microsoft.com/office/word/2010/wordprocessingShape" mc:Ignorable="w14 w15 w16se w16cid w16 w16cex w16sdtdh w16sdtfl w16du wp14">
+  <w:abstractNum w:abstractNumId="0" w15:restartNumberingAfterBreak="0">
     <w:nsid w:val="0000A990"/>
     <w:multiLevelType w:val="multilevel"/>
+    <w:tmpl w:val="41A0ECA2"/>
     <w:lvl w:ilvl="0">
       <w:numFmt w:val="bullet"/>
       <w:lvlText w:val=" "/>
@@ -1189,9 +963,10 @@
       </w:pPr>
     </w:lvl>
   </w:abstractNum>
-  <w:abstractNum w:abstractNumId="991">
+  <w:abstractNum w:abstractNumId="1" w15:restartNumberingAfterBreak="0">
     <w:nsid w:val="0000A991"/>
     <w:multiLevelType w:val="multilevel"/>
+    <w:tmpl w:val="ECF89654"/>
     <w:lvl w:ilvl="0">
       <w:numFmt w:val="bullet"/>
       <w:lvlText w:val=""/>
@@ -1292,9 +1067,10 @@
       </w:rPr>
     </w:lvl>
   </w:abstractNum>
-  <w:abstractNum w:abstractNumId="99411">
+  <w:abstractNum w:abstractNumId="2" w15:restartNumberingAfterBreak="0">
     <w:nsid w:val="00A99411"/>
     <w:multiLevelType w:val="multilevel"/>
+    <w:tmpl w:val="B162AE08"/>
     <w:lvl w:ilvl="0">
       <w:start w:val="1"/>
       <w:numFmt w:val="decimal"/>
@@ -1377,20 +1153,20 @@
       </w:pPr>
     </w:lvl>
   </w:abstractNum>
-  <w:num w:numId="1000">
-    <w:abstractNumId w:val="990"/>
+  <w:num w:numId="1" w16cid:durableId="336814674">
+    <w:abstractNumId w:val="0"/>
   </w:num>
-  <w:num w:numId="1001">
-    <w:abstractNumId w:val="991"/>
+  <w:num w:numId="2" w16cid:durableId="643657283">
+    <w:abstractNumId w:val="1"/>
   </w:num>
-  <w:num w:numId="1002">
-    <w:abstractNumId w:val="991"/>
+  <w:num w:numId="3" w16cid:durableId="783965180">
+    <w:abstractNumId w:val="1"/>
   </w:num>
-  <w:num w:numId="1003">
-    <w:abstractNumId w:val="991"/>
+  <w:num w:numId="4" w16cid:durableId="1456632506">
+    <w:abstractNumId w:val="1"/>
   </w:num>
-  <w:num w:numId="1004">
-    <w:abstractNumId w:val="99411"/>
+  <w:num w:numId="5" w16cid:durableId="616451272">
+    <w:abstractNumId w:val="2"/>
     <w:lvlOverride w:ilvl="0">
       <w:startOverride w:val="1"/>
     </w:lvlOverride>
@@ -1423,14 +1199,14 @@
 </file>
 
 <file path=word/styles.xml><?xml version="1.0" encoding="utf-8"?>
-<w:styles xmlns:r="http://schemas.openxmlformats.org/officeDocument/2006/relationships" xmlns:w="http://schemas.openxmlformats.org/wordprocessingml/2006/main">
+<w:styles xmlns:mc="http://schemas.openxmlformats.org/markup-compatibility/2006" xmlns:r="http://schemas.openxmlformats.org/officeDocument/2006/relationships" xmlns:w="http://schemas.openxmlformats.org/wordprocessingml/2006/main" xmlns:w14="http://schemas.microsoft.com/office/word/2010/wordml" xmlns:w15="http://schemas.microsoft.com/office/word/2012/wordml" xmlns:w16cex="http://schemas.microsoft.com/office/word/2018/wordml/cex" xmlns:w16cid="http://schemas.microsoft.com/office/word/2016/wordml/cid" xmlns:w16="http://schemas.microsoft.com/office/word/2018/wordml" xmlns:w16du="http://schemas.microsoft.com/office/word/2023/wordml/word16du" xmlns:w16sdtdh="http://schemas.microsoft.com/office/word/2020/wordml/sdtdatahash" xmlns:w16sdtfl="http://schemas.microsoft.com/office/word/2024/wordml/sdtformatlock" xmlns:w16se="http://schemas.microsoft.com/office/word/2015/wordml/symex" mc:Ignorable="w14 w15 w16se w16cid w16 w16cex w16sdtdh w16sdtfl w16du">
   <w:docDefaults>
     <w:rPrDefault>
       <w:rPr>
-        <w:rFonts w:asciiTheme="minorHAnsi" w:cstheme="minorBidi" w:eastAsiaTheme="minorEastAsia" w:hAnsiTheme="minorHAnsi"/>
+        <w:rFonts w:asciiTheme="minorHAnsi" w:eastAsiaTheme="minorEastAsia" w:hAnsiTheme="minorHAnsi" w:cstheme="minorBidi"/>
         <w:sz w:val="24"/>
         <w:szCs w:val="24"/>
-        <w:lang w:bidi="ar-SA" w:eastAsia="zh-CN" w:val="en-US"/>
+        <w:lang w:val="en-US" w:eastAsia="zh-CN" w:bidi="ar-SA"/>
       </w:rPr>
     </w:rPrDefault>
     <w:pPrDefault>
@@ -1439,168 +1215,255 @@
       </w:pPr>
     </w:pPrDefault>
   </w:docDefaults>
-  <w:latentStyles w:count="276" w:defLockedState="0" w:defQFormat="0" w:defSemiHidden="0" w:defUIPriority="0" w:defUnhideWhenUsed="0"/>
-  <w:style w:default="1" w:styleId="Normal" w:type="paragraph">
+  <w:latentStyles w:defLockedState="0" w:defUIPriority="0" w:defSemiHidden="0" w:defUnhideWhenUsed="0" w:defQFormat="0" w:count="376">
+    <w:lsdException w:name="Normal Table" w:semiHidden="1" w:unhideWhenUsed="1"/>
+    <w:lsdException w:name="Table Simple 1" w:semiHidden="1" w:unhideWhenUsed="1"/>
+    <w:lsdException w:name="Table Simple 2" w:semiHidden="1" w:unhideWhenUsed="1"/>
+    <w:lsdException w:name="Table Simple 3" w:semiHidden="1" w:unhideWhenUsed="1"/>
+    <w:lsdException w:name="Table Classic 1" w:semiHidden="1" w:unhideWhenUsed="1"/>
+    <w:lsdException w:name="Table Classic 2" w:semiHidden="1" w:unhideWhenUsed="1"/>
+    <w:lsdException w:name="Table Classic 3" w:semiHidden="1" w:unhideWhenUsed="1"/>
+    <w:lsdException w:name="Table Classic 4" w:semiHidden="1" w:unhideWhenUsed="1"/>
+    <w:lsdException w:name="Table Colorful 1" w:semiHidden="1" w:unhideWhenUsed="1"/>
+    <w:lsdException w:name="Table Colorful 2" w:semiHidden="1" w:unhideWhenUsed="1"/>
+    <w:lsdException w:name="Table Colorful 3" w:semiHidden="1" w:unhideWhenUsed="1"/>
+    <w:lsdException w:name="Table Columns 1" w:semiHidden="1" w:unhideWhenUsed="1"/>
+    <w:lsdException w:name="Table Columns 2" w:semiHidden="1" w:unhideWhenUsed="1"/>
+    <w:lsdException w:name="Table Columns 3" w:semiHidden="1" w:unhideWhenUsed="1"/>
+    <w:lsdException w:name="Table Columns 4" w:semiHidden="1" w:unhideWhenUsed="1"/>
+    <w:lsdException w:name="Table Columns 5" w:semiHidden="1" w:unhideWhenUsed="1"/>
+    <w:lsdException w:name="Table Grid 1" w:semiHidden="1" w:unhideWhenUsed="1"/>
+    <w:lsdException w:name="Table Grid 2" w:semiHidden="1" w:unhideWhenUsed="1"/>
+    <w:lsdException w:name="Table Grid 3" w:semiHidden="1" w:unhideWhenUsed="1"/>
+    <w:lsdException w:name="Table Grid 4" w:semiHidden="1" w:unhideWhenUsed="1"/>
+    <w:lsdException w:name="Table Grid 5" w:semiHidden="1" w:unhideWhenUsed="1"/>
+    <w:lsdException w:name="Table Grid 6" w:semiHidden="1" w:unhideWhenUsed="1"/>
+    <w:lsdException w:name="Table Grid 7" w:semiHidden="1" w:unhideWhenUsed="1"/>
+    <w:lsdException w:name="Table Grid 8" w:semiHidden="1" w:unhideWhenUsed="1"/>
+    <w:lsdException w:name="Table List 1" w:semiHidden="1" w:unhideWhenUsed="1"/>
+    <w:lsdException w:name="Table List 2" w:semiHidden="1" w:unhideWhenUsed="1"/>
+    <w:lsdException w:name="Table List 3" w:semiHidden="1" w:unhideWhenUsed="1"/>
+    <w:lsdException w:name="Table List 4" w:semiHidden="1" w:unhideWhenUsed="1"/>
+    <w:lsdException w:name="Table List 5" w:semiHidden="1" w:unhideWhenUsed="1"/>
+    <w:lsdException w:name="Table List 6" w:semiHidden="1" w:unhideWhenUsed="1"/>
+    <w:lsdException w:name="Table List 7" w:semiHidden="1" w:unhideWhenUsed="1"/>
+    <w:lsdException w:name="Table List 8" w:semiHidden="1" w:unhideWhenUsed="1"/>
+    <w:lsdException w:name="Table 3D effects 1" w:semiHidden="1" w:unhideWhenUsed="1"/>
+    <w:lsdException w:name="Table 3D effects 2" w:semiHidden="1" w:unhideWhenUsed="1"/>
+    <w:lsdException w:name="Table 3D effects 3" w:semiHidden="1" w:unhideWhenUsed="1"/>
+    <w:lsdException w:name="Table Contemporary" w:semiHidden="1" w:unhideWhenUsed="1"/>
+    <w:lsdException w:name="Table Elegant" w:semiHidden="1" w:unhideWhenUsed="1"/>
+    <w:lsdException w:name="Table Professional" w:semiHidden="1" w:unhideWhenUsed="1"/>
+    <w:lsdException w:name="Table Subtle 1" w:semiHidden="1" w:unhideWhenUsed="1"/>
+    <w:lsdException w:name="Table Subtle 2" w:semiHidden="1" w:unhideWhenUsed="1"/>
+    <w:lsdException w:name="Table Web 1" w:semiHidden="1" w:unhideWhenUsed="1"/>
+    <w:lsdException w:name="Table Web 2" w:semiHidden="1" w:unhideWhenUsed="1"/>
+    <w:lsdException w:name="Table Web 3" w:semiHidden="1" w:unhideWhenUsed="1"/>
+    <w:lsdException w:name="Table Theme" w:semiHidden="1" w:unhideWhenUsed="1"/>
+    <w:lsdException w:name="Light Shading"/>
+    <w:lsdException w:name="Light List"/>
+    <w:lsdException w:name="Light Grid"/>
+    <w:lsdException w:name="Medium Shading 1"/>
+    <w:lsdException w:name="Medium Shading 2"/>
+    <w:lsdException w:name="Medium List 1"/>
+    <w:lsdException w:name="Medium List 2"/>
+    <w:lsdException w:name="Medium Grid 1"/>
+    <w:lsdException w:name="Medium Grid 2"/>
+    <w:lsdException w:name="Medium Grid 3"/>
+    <w:lsdException w:name="Dark List"/>
+    <w:lsdException w:name="Colorful Shading"/>
+    <w:lsdException w:name="Colorful List"/>
+    <w:lsdException w:name="Colorful Grid"/>
+    <w:lsdException w:name="Light Shading Accent 1"/>
+    <w:lsdException w:name="Light List Accent 1"/>
+    <w:lsdException w:name="Light Grid Accent 1"/>
+    <w:lsdException w:name="Medium Shading 1 Accent 1"/>
+    <w:lsdException w:name="Medium Shading 2 Accent 1"/>
+    <w:lsdException w:name="Medium List 1 Accent 1"/>
+    <w:lsdException w:name="Medium List 2 Accent 1"/>
+    <w:lsdException w:name="Medium Grid 1 Accent 1"/>
+    <w:lsdException w:name="Medium Grid 2 Accent 1"/>
+    <w:lsdException w:name="Medium Grid 3 Accent 1"/>
+    <w:lsdException w:name="Dark List Accent 1"/>
+    <w:lsdException w:name="Colorful Shading Accent 1"/>
+    <w:lsdException w:name="Colorful List Accent 1"/>
+    <w:lsdException w:name="Colorful Grid Accent 1"/>
+    <w:lsdException w:name="Light Shading Accent 2"/>
+    <w:lsdException w:name="Light List Accent 2"/>
+    <w:lsdException w:name="Light Grid Accent 2"/>
+    <w:lsdException w:name="Medium Shading 1 Accent 2"/>
+    <w:lsdException w:name="Medium Shading 2 Accent 2"/>
+    <w:lsdException w:name="Medium List 1 Accent 2"/>
+    <w:lsdException w:name="Medium List 2 Accent 2"/>
+    <w:lsdException w:name="Medium Grid 1 Accent 2"/>
+    <w:lsdException w:name="Medium Grid 2 Accent 2"/>
+    <w:lsdException w:name="Medium Grid 3 Accent 2"/>
+    <w:lsdException w:name="Dark List Accent 2"/>
+    <w:lsdException w:name="Colorful Shading Accent 2"/>
+    <w:lsdException w:name="Colorful List Accent 2"/>
+    <w:lsdException w:name="Colorful Grid Accent 2"/>
+    <w:lsdException w:name="Light Shading Accent 3"/>
+    <w:lsdException w:name="Light List Accent 3"/>
+    <w:lsdException w:name="Light Grid Accent 3"/>
+    <w:lsdException w:name="Medium Shading 1 Accent 3"/>
+    <w:lsdException w:name="Medium Shading 2 Accent 3"/>
+    <w:lsdException w:name="Medium List 1 Accent 3"/>
+    <w:lsdException w:name="Medium List 2 Accent 3"/>
+    <w:lsdException w:name="Medium Grid 1 Accent 3"/>
+    <w:lsdException w:name="Medium Grid 2 Accent 3"/>
+    <w:lsdException w:name="Medium Grid 3 Accent 3"/>
+    <w:lsdException w:name="Dark List Accent 3"/>
+    <w:lsdException w:name="Colorful Shading Accent 3"/>
+    <w:lsdException w:name="Colorful List Accent 3"/>
+    <w:lsdException w:name="Colorful Grid Accent 3"/>
+    <w:lsdException w:name="Light Shading Accent 4"/>
+    <w:lsdException w:name="Light List Accent 4"/>
+    <w:lsdException w:name="Light Grid Accent 4"/>
+    <w:lsdException w:name="Medium Shading 1 Accent 4"/>
+    <w:lsdException w:name="Medium Shading 2 Accent 4"/>
+    <w:lsdException w:name="Medium List 1 Accent 4"/>
+    <w:lsdException w:name="Medium List 2 Accent 4"/>
+    <w:lsdException w:name="Medium Grid 1 Accent 4"/>
+    <w:lsdException w:name="Medium Grid 2 Accent 4"/>
+    <w:lsdException w:name="Medium Grid 3 Accent 4"/>
+    <w:lsdException w:name="Dark List Accent 4"/>
+    <w:lsdException w:name="Colorful Shading Accent 4"/>
+    <w:lsdException w:name="Colorful List Accent 4"/>
+    <w:lsdException w:name="Colorful Grid Accent 4"/>
+    <w:lsdException w:name="Light Shading Accent 5"/>
+    <w:lsdException w:name="Light List Accent 5"/>
+    <w:lsdException w:name="Light Grid Accent 5"/>
+    <w:lsdException w:name="Medium Shading 1 Accent 5"/>
+    <w:lsdException w:name="Medium Shading 2 Accent 5"/>
+    <w:lsdException w:name="Medium List 1 Accent 5"/>
+    <w:lsdException w:name="Medium List 2 Accent 5"/>
+    <w:lsdException w:name="Medium Grid 1 Accent 5"/>
+    <w:lsdException w:name="Medium Grid 2 Accent 5"/>
+    <w:lsdException w:name="Medium Grid 3 Accent 5"/>
+    <w:lsdException w:name="Dark List Accent 5"/>
+    <w:lsdException w:name="Colorful Shading Accent 5"/>
+    <w:lsdException w:name="Colorful List Accent 5"/>
+    <w:lsdException w:name="Colorful Grid Accent 5"/>
+    <w:lsdException w:name="Light Shading Accent 6"/>
+    <w:lsdException w:name="Light List Accent 6"/>
+    <w:lsdException w:name="Light Grid Accent 6"/>
+    <w:lsdException w:name="Medium Shading 1 Accent 6"/>
+    <w:lsdException w:name="Medium Shading 2 Accent 6"/>
+    <w:lsdException w:name="Medium List 1 Accent 6"/>
+    <w:lsdException w:name="Medium List 2 Accent 6"/>
+    <w:lsdException w:name="Medium Grid 1 Accent 6"/>
+    <w:lsdException w:name="Medium Grid 2 Accent 6"/>
+    <w:lsdException w:name="Medium Grid 3 Accent 6"/>
+    <w:lsdException w:name="Dark List Accent 6"/>
+    <w:lsdException w:name="Colorful Shading Accent 6"/>
+    <w:lsdException w:name="Colorful List Accent 6"/>
+    <w:lsdException w:name="Colorful Grid Accent 6"/>
+    <w:lsdException w:name="Grid Table 4" w:uiPriority="49"/>
+    <w:lsdException w:name="Grid Table 5 Dark" w:uiPriority="50"/>
+    <w:lsdException w:name="Grid Table 6 Colorful" w:uiPriority="51"/>
+    <w:lsdException w:name="Grid Table 7 Colorful" w:uiPriority="52"/>
+    <w:lsdException w:name="Grid Table 1 Light Accent 1" w:uiPriority="46"/>
+    <w:lsdException w:name="Grid Table 2 Accent 1" w:uiPriority="47"/>
+    <w:lsdException w:name="Grid Table 3 Accent 1" w:uiPriority="48"/>
+    <w:lsdException w:name="Grid Table 4 Accent 1" w:uiPriority="49"/>
+    <w:lsdException w:name="Grid Table 5 Dark Accent 1" w:uiPriority="50"/>
+    <w:lsdException w:name="Grid Table 6 Colorful Accent 1" w:uiPriority="51"/>
+    <w:lsdException w:name="Grid Table 7 Colorful Accent 1" w:uiPriority="52"/>
+    <w:lsdException w:name="Grid Table 1 Light Accent 2" w:uiPriority="46"/>
+    <w:lsdException w:name="Grid Table 2 Accent 2" w:uiPriority="47"/>
+    <w:lsdException w:name="Grid Table 3 Accent 2" w:uiPriority="48"/>
+    <w:lsdException w:name="Grid Table 4 Accent 2" w:uiPriority="49"/>
+    <w:lsdException w:name="Grid Table 5 Dark Accent 2" w:uiPriority="50"/>
+    <w:lsdException w:name="Grid Table 6 Colorful Accent 2" w:uiPriority="51"/>
+    <w:lsdException w:name="Grid Table 7 Colorful Accent 2" w:uiPriority="52"/>
+    <w:lsdException w:name="Grid Table 1 Light Accent 3" w:uiPriority="46"/>
+    <w:lsdException w:name="Grid Table 2 Accent 3" w:uiPriority="47"/>
+    <w:lsdException w:name="Grid Table 3 Accent 3" w:uiPriority="48"/>
+    <w:lsdException w:name="Grid Table 4 Accent 3" w:uiPriority="49"/>
+    <w:lsdException w:name="Grid Table 5 Dark Accent 3" w:uiPriority="50"/>
+    <w:lsdException w:name="Grid Table 6 Colorful Accent 3" w:uiPriority="51"/>
+    <w:lsdException w:name="Grid Table 7 Colorful Accent 3" w:uiPriority="52"/>
+    <w:lsdException w:name="Grid Table 1 Light Accent 4" w:uiPriority="46"/>
+    <w:lsdException w:name="Grid Table 2 Accent 4" w:uiPriority="47"/>
+    <w:lsdException w:name="Grid Table 3 Accent 4" w:uiPriority="48"/>
+    <w:lsdException w:name="Grid Table 4 Accent 4" w:uiPriority="49"/>
+    <w:lsdException w:name="Grid Table 5 Dark Accent 4" w:uiPriority="50"/>
+    <w:lsdException w:name="Grid Table 6 Colorful Accent 4" w:uiPriority="51"/>
+    <w:lsdException w:name="Grid Table 7 Colorful Accent 4" w:uiPriority="52"/>
+    <w:lsdException w:name="Grid Table 1 Light Accent 5" w:uiPriority="46"/>
+    <w:lsdException w:name="Grid Table 2 Accent 5" w:uiPriority="47"/>
+    <w:lsdException w:name="Grid Table 3 Accent 5" w:uiPriority="48"/>
+    <w:lsdException w:name="Grid Table 4 Accent 5" w:uiPriority="49"/>
+    <w:lsdException w:name="Grid Table 5 Dark Accent 5" w:uiPriority="50"/>
+    <w:lsdException w:name="Grid Table 6 Colorful Accent 5" w:uiPriority="51"/>
+    <w:lsdException w:name="Grid Table 7 Colorful Accent 5" w:uiPriority="52"/>
+    <w:lsdException w:name="Grid Table 1 Light Accent 6" w:uiPriority="46"/>
+    <w:lsdException w:name="Grid Table 2 Accent 6" w:uiPriority="47"/>
+    <w:lsdException w:name="Grid Table 3 Accent 6" w:uiPriority="48"/>
+    <w:lsdException w:name="Grid Table 4 Accent 6" w:uiPriority="49"/>
+    <w:lsdException w:name="Grid Table 5 Dark Accent 6" w:uiPriority="50"/>
+    <w:lsdException w:name="Grid Table 6 Colorful Accent 6" w:uiPriority="51"/>
+    <w:lsdException w:name="Grid Table 7 Colorful Accent 6" w:uiPriority="52"/>
+    <w:lsdException w:name="List Table 1 Light" w:uiPriority="46"/>
+    <w:lsdException w:name="List Table 2" w:uiPriority="47"/>
+    <w:lsdException w:name="List Table 3" w:uiPriority="48"/>
+    <w:lsdException w:name="List Table 4" w:uiPriority="49"/>
+    <w:lsdException w:name="List Table 5 Dark" w:uiPriority="50"/>
+    <w:lsdException w:name="List Table 6 Colorful" w:uiPriority="51"/>
+    <w:lsdException w:name="List Table 7 Colorful" w:uiPriority="52"/>
+    <w:lsdException w:name="List Table 1 Light Accent 1" w:uiPriority="46"/>
+    <w:lsdException w:name="List Table 2 Accent 1" w:uiPriority="47"/>
+    <w:lsdException w:name="List Table 3 Accent 1" w:uiPriority="48"/>
+    <w:lsdException w:name="List Table 4 Accent 1" w:uiPriority="49"/>
+    <w:lsdException w:name="List Table 5 Dark Accent 1" w:uiPriority="50"/>
+    <w:lsdException w:name="List Table 6 Colorful Accent 1" w:uiPriority="51"/>
+    <w:lsdException w:name="List Table 7 Colorful Accent 1" w:uiPriority="52"/>
+    <w:lsdException w:name="List Table 1 Light Accent 2" w:uiPriority="46"/>
+    <w:lsdException w:name="List Table 2 Accent 2" w:uiPriority="47"/>
+    <w:lsdException w:name="List Table 3 Accent 2" w:uiPriority="48"/>
+    <w:lsdException w:name="List Table 4 Accent 2" w:uiPriority="49"/>
+    <w:lsdException w:name="List Table 5 Dark Accent 2" w:uiPriority="50"/>
+    <w:lsdException w:name="List Table 6 Colorful Accent 2" w:uiPriority="51"/>
+    <w:lsdException w:name="List Table 7 Colorful Accent 2" w:uiPriority="52"/>
+    <w:lsdException w:name="List Table 1 Light Accent 3" w:uiPriority="46"/>
+    <w:lsdException w:name="List Table 2 Accent 3" w:uiPriority="47"/>
+    <w:lsdException w:name="List Table 3 Accent 3" w:uiPriority="48"/>
+    <w:lsdException w:name="List Table 4 Accent 3" w:uiPriority="49"/>
+    <w:lsdException w:name="List Table 5 Dark Accent 3" w:uiPriority="50"/>
+    <w:lsdException w:name="List Table 6 Colorful Accent 3" w:uiPriority="51"/>
+    <w:lsdException w:name="List Table 7 Colorful Accent 3" w:uiPriority="52"/>
+    <w:lsdException w:name="List Table 1 Light Accent 4" w:uiPriority="46"/>
+    <w:lsdException w:name="List Table 2 Accent 4" w:uiPriority="47"/>
+    <w:lsdException w:name="List Table 3 Accent 4" w:uiPriority="48"/>
+    <w:lsdException w:name="List Table 4 Accent 4" w:uiPriority="49"/>
+    <w:lsdException w:name="List Table 5 Dark Accent 4" w:uiPriority="50"/>
+    <w:lsdException w:name="List Table 6 Colorful Accent 4" w:uiPriority="51"/>
+    <w:lsdException w:name="List Table 7 Colorful Accent 4" w:uiPriority="52"/>
+    <w:lsdException w:name="List Table 1 Light Accent 5" w:uiPriority="46"/>
+    <w:lsdException w:name="List Table 2 Accent 5" w:uiPriority="47"/>
+    <w:lsdException w:name="List Table 3 Accent 5" w:uiPriority="48"/>
+    <w:lsdException w:name="List Table 4 Accent 5" w:uiPriority="49"/>
+    <w:lsdException w:name="List Table 5 Dark Accent 5" w:uiPriority="50"/>
+    <w:lsdException w:name="List Table 6 Colorful Accent 5" w:uiPriority="51"/>
+    <w:lsdException w:name="List Table 7 Colorful Accent 5" w:uiPriority="52"/>
+    <w:lsdException w:name="List Table 1 Light Accent 6" w:uiPriority="46"/>
+    <w:lsdException w:name="List Table 2 Accent 6" w:uiPriority="47"/>
+    <w:lsdException w:name="List Table 3 Accent 6" w:uiPriority="48"/>
+    <w:lsdException w:name="List Table 4 Accent 6" w:uiPriority="49"/>
+    <w:lsdException w:name="List Table 5 Dark Accent 6" w:uiPriority="50"/>
+    <w:lsdException w:name="List Table 6 Colorful Accent 6" w:uiPriority="51"/>
+    <w:lsdException w:name="List Table 7 Colorful Accent 6" w:uiPriority="52"/>
+    <w:lsdException w:name="Mention" w:semiHidden="1" w:uiPriority="99" w:unhideWhenUsed="1"/>
+    <w:lsdException w:name="Smart Hyperlink" w:semiHidden="1" w:uiPriority="99" w:unhideWhenUsed="1"/>
+    <w:lsdException w:name="Hashtag" w:semiHidden="1" w:uiPriority="99" w:unhideWhenUsed="1"/>
+    <w:lsdException w:name="Unresolved Mention" w:semiHidden="1" w:uiPriority="99" w:unhideWhenUsed="1"/>
+    <w:lsdException w:name="Smart Link" w:semiHidden="1" w:uiPriority="99" w:unhideWhenUsed="1"/>
+  </w:latentStyles>
+  <w:style w:type="paragraph" w:default="1" w:styleId="Normal">
     <w:name w:val="Normal"/>
     <w:qFormat/>
   </w:style>
-  <w:style w:styleId="BodyText" w:type="paragraph">
-    <w:name w:val="Body Text"/>
-    <w:basedOn w:val="Normal"/>
-    <w:link w:val="BodyTextChar"/>
-    <w:qFormat/>
-    <w:pPr>
-      <w:spacing w:after="180" w:before="180"/>
-    </w:pPr>
-  </w:style>
-  <w:style w:customStyle="1" w:styleId="FirstParagraph" w:type="paragraph">
-    <w:name w:val="First Paragraph"/>
-    <w:basedOn w:val="BodyText"/>
-    <w:next w:val="BodyText"/>
-    <w:qFormat/>
-  </w:style>
-  <w:style w:customStyle="1" w:styleId="Compact" w:type="paragraph">
-    <w:name w:val="Compact"/>
-    <w:basedOn w:val="BodyText"/>
-    <w:qFormat/>
-    <w:pPr>
-      <w:spacing w:after="36" w:before="36"/>
-    </w:pPr>
-  </w:style>
-  <w:style w:styleId="Title" w:type="paragraph">
-    <w:name w:val="Title"/>
-    <w:basedOn w:val="Normal"/>
-    <w:next w:val="BodyText"/>
-    <w:link w:val="TitleChar"/>
-    <w:uiPriority w:val="10"/>
-    <w:qFormat/>
-    <w:rsid w:val="00A10FD9"/>
-    <w:pPr>
-      <w:spacing w:after="80" w:line="240" w:lineRule="auto"/>
-      <w:contextualSpacing/>
-      <w:jc w:val="center"/>
-    </w:pPr>
-    <w:rPr>
-      <w:rFonts w:asciiTheme="majorHAnsi" w:cstheme="majorBidi" w:eastAsiaTheme="majorEastAsia" w:hAnsiTheme="majorHAnsi"/>
-      <w:sz w:val="56"/>
-      <w:szCs w:val="56"/>
-    </w:rPr>
-  </w:style>
-  <w:style w:customStyle="1" w:styleId="TitleChar" w:type="character">
-    <w:name w:val="Title Char"/>
-    <w:basedOn w:val="DefaultParagraphFont"/>
-    <w:link w:val="Title"/>
-    <w:uiPriority w:val="10"/>
-    <w:rsid w:val="00A10FD9"/>
-    <w:rPr>
-      <w:rFonts w:asciiTheme="majorHAnsi" w:cstheme="majorBidi" w:eastAsiaTheme="majorEastAsia" w:hAnsiTheme="majorHAnsi"/>
-      <w:sz w:val="56"/>
-      <w:szCs w:val="56"/>
-    </w:rPr>
-  </w:style>
-  <w:style w:styleId="Subtitle" w:type="paragraph">
-    <w:name w:val="Subtitle"/>
-    <w:basedOn w:val="Title"/>
-    <w:next w:val="BodyText"/>
-    <w:link w:val="SubtitleChar"/>
-    <w:uiPriority w:val="11"/>
-    <w:qFormat/>
-    <w:rsid w:val="00A10FD9"/>
-    <w:pPr>
-      <w:numPr>
-        <w:ilvl w:val="1"/>
-      </w:numPr>
-    </w:pPr>
-    <w:rPr>
-      <w:rFonts w:cstheme="majorBidi" w:eastAsiaTheme="majorEastAsia"/>
-      <w:spacing w:val="15"/>
-      <w:sz w:val="28"/>
-      <w:szCs w:val="28"/>
-    </w:rPr>
-  </w:style>
-  <w:style w:customStyle="1" w:styleId="SubtitleChar" w:type="character">
-    <w:name w:val="Subtitle Char"/>
-    <w:basedOn w:val="DefaultParagraphFont"/>
-    <w:link w:val="Subtitle"/>
-    <w:uiPriority w:val="11"/>
-    <w:rsid w:val="00A10FD9"/>
-    <w:rPr>
-      <w:rFonts w:cstheme="majorBidi" w:eastAsiaTheme="majorEastAsia"/>
-      <w:color w:themeColor="text1" w:themeTint="A6" w:val="595959"/>
-      <w:spacing w:val="15"/>
-      <w:sz w:val="28"/>
-      <w:szCs w:val="28"/>
-    </w:rPr>
-  </w:style>
-  <w:style w:customStyle="1" w:styleId="Author" w:type="paragraph">
-    <w:name w:val="Author"/>
-    <w:basedOn w:val="Title"/>
-    <w:next w:val="BodyText"/>
-    <w:qFormat/>
-    <w:pPr>
-      <w:keepNext/>
-      <w:keepLines/>
-    </w:pPr>
-    <w:rPr>
-      <w:sz w:val="24"/>
-      <w:szCs w:val="24"/>
-    </w:rPr>
-  </w:style>
-  <w:style w:styleId="Date" w:type="paragraph">
-    <w:name w:val="Date"/>
-    <w:basedOn w:val="Title"/>
-    <w:next w:val="BodyText"/>
-    <w:qFormat/>
-    <w:pPr>
-      <w:keepNext/>
-      <w:keepLines/>
-    </w:pPr>
-    <w:rPr>
-      <w:sz w:val="24"/>
-      <w:szCs w:val="24"/>
-    </w:rPr>
-  </w:style>
-  <w:style w:customStyle="1" w:styleId="AbstractTitle" w:type="paragraph">
-    <w:name w:val="Abstract Title"/>
-    <w:basedOn w:val="Normal"/>
-    <w:next w:val="Abstract"/>
-    <w:qFormat/>
-    <w:pPr>
-      <w:keepNext/>
-      <w:keepLines/>
-      <w:spacing w:after="0" w:before="300"/>
-      <w:jc w:val="center"/>
-    </w:pPr>
-    <w:rPr>
-      <w:b/>
-      <w:sz w:val="20"/>
-      <w:szCs w:val="20"/>
-    </w:rPr>
-  </w:style>
-  <w:style w:customStyle="1" w:styleId="Abstract" w:type="paragraph">
-    <w:name w:val="Abstract"/>
-    <w:basedOn w:val="Normal"/>
-    <w:next w:val="BodyText"/>
-    <w:qFormat/>
-    <w:pPr>
-      <w:keepNext/>
-      <w:keepLines/>
-      <w:spacing w:after="300" w:before="100"/>
-    </w:pPr>
-    <w:rPr>
-      <w:sz w:val="20"/>
-      <w:szCs w:val="20"/>
-    </w:rPr>
-  </w:style>
-  <w:style w:styleId="Bibliography" w:type="paragraph">
-    <w:name w:val="Bibliography"/>
-    <w:basedOn w:val="Normal"/>
-    <w:next w:val="Bibliography"/>
-    <w:qFormat/>
-    <w:pPr/>
-    <w:rPr/>
-  </w:style>
-  <w:style w:styleId="Heading1" w:type="paragraph">
+  <w:style w:type="paragraph" w:styleId="Heading1">
     <w:name w:val="heading 1"/>
     <w:basedOn w:val="Normal"/>
     <w:next w:val="BodyText"/>
@@ -1611,17 +1474,17 @@
     <w:pPr>
       <w:keepNext/>
       <w:keepLines/>
-      <w:spacing w:after="80" w:before="360"/>
+      <w:spacing w:before="360" w:after="80"/>
       <w:outlineLvl w:val="0"/>
     </w:pPr>
     <w:rPr>
-      <w:rFonts w:asciiTheme="majorHAnsi" w:cstheme="majorBidi" w:eastAsiaTheme="majorEastAsia" w:hAnsiTheme="majorHAnsi"/>
-      <w:color w:themeColor="accent1" w:themeShade="BF" w:val="0F4761"/>
+      <w:rFonts w:asciiTheme="majorHAnsi" w:eastAsiaTheme="majorEastAsia" w:hAnsiTheme="majorHAnsi" w:cstheme="majorBidi"/>
+      <w:color w:val="0F4761" w:themeColor="accent1" w:themeShade="BF"/>
       <w:sz w:val="40"/>
       <w:szCs w:val="40"/>
     </w:rPr>
   </w:style>
-  <w:style w:styleId="Heading2" w:type="paragraph">
+  <w:style w:type="paragraph" w:styleId="Heading2">
     <w:name w:val="heading 2"/>
     <w:basedOn w:val="Normal"/>
     <w:next w:val="BodyText"/>
@@ -1634,17 +1497,17 @@
     <w:pPr>
       <w:keepNext/>
       <w:keepLines/>
-      <w:spacing w:after="80" w:before="160"/>
+      <w:spacing w:before="160" w:after="80"/>
       <w:outlineLvl w:val="1"/>
     </w:pPr>
     <w:rPr>
-      <w:rFonts w:asciiTheme="majorHAnsi" w:cstheme="majorBidi" w:eastAsiaTheme="majorEastAsia" w:hAnsiTheme="majorHAnsi"/>
-      <w:color w:themeColor="accent1" w:themeShade="BF" w:val="0F4761"/>
+      <w:rFonts w:asciiTheme="majorHAnsi" w:eastAsiaTheme="majorEastAsia" w:hAnsiTheme="majorHAnsi" w:cstheme="majorBidi"/>
+      <w:color w:val="0F4761" w:themeColor="accent1" w:themeShade="BF"/>
       <w:sz w:val="32"/>
       <w:szCs w:val="32"/>
     </w:rPr>
   </w:style>
-  <w:style w:styleId="Heading3" w:type="paragraph">
+  <w:style w:type="paragraph" w:styleId="Heading3">
     <w:name w:val="heading 3"/>
     <w:basedOn w:val="Normal"/>
     <w:next w:val="BodyText"/>
@@ -1657,17 +1520,17 @@
     <w:pPr>
       <w:keepNext/>
       <w:keepLines/>
-      <w:spacing w:after="80" w:before="160"/>
+      <w:spacing w:before="160" w:after="80"/>
       <w:outlineLvl w:val="2"/>
     </w:pPr>
     <w:rPr>
-      <w:rFonts w:cstheme="majorBidi" w:eastAsiaTheme="majorEastAsia"/>
-      <w:color w:themeColor="accent1" w:themeShade="BF" w:val="0F4761"/>
+      <w:rFonts w:eastAsiaTheme="majorEastAsia" w:cstheme="majorBidi"/>
+      <w:color w:val="0F4761" w:themeColor="accent1" w:themeShade="BF"/>
       <w:sz w:val="28"/>
       <w:szCs w:val="28"/>
     </w:rPr>
   </w:style>
-  <w:style w:styleId="Heading4" w:type="paragraph">
+  <w:style w:type="paragraph" w:styleId="Heading4">
     <w:name w:val="heading 4"/>
     <w:basedOn w:val="Normal"/>
     <w:next w:val="BodyText"/>
@@ -1680,17 +1543,17 @@
     <w:pPr>
       <w:keepNext/>
       <w:keepLines/>
-      <w:spacing w:after="40" w:before="80"/>
+      <w:spacing w:before="80" w:after="40"/>
       <w:outlineLvl w:val="3"/>
     </w:pPr>
     <w:rPr>
-      <w:rFonts w:cstheme="majorBidi" w:eastAsiaTheme="majorEastAsia"/>
+      <w:rFonts w:eastAsiaTheme="majorEastAsia" w:cstheme="majorBidi"/>
       <w:i/>
       <w:iCs/>
-      <w:color w:themeColor="accent1" w:themeShade="BF" w:val="0F4761"/>
-    </w:rPr>
-  </w:style>
-  <w:style w:styleId="Heading5" w:type="paragraph">
+      <w:color w:val="0F4761" w:themeColor="accent1" w:themeShade="BF"/>
+    </w:rPr>
+  </w:style>
+  <w:style w:type="paragraph" w:styleId="Heading5">
     <w:name w:val="heading 5"/>
     <w:basedOn w:val="Normal"/>
     <w:next w:val="BodyText"/>
@@ -1703,15 +1566,15 @@
     <w:pPr>
       <w:keepNext/>
       <w:keepLines/>
-      <w:spacing w:after="40" w:before="80"/>
+      <w:spacing w:before="80" w:after="40"/>
       <w:outlineLvl w:val="4"/>
     </w:pPr>
     <w:rPr>
-      <w:rFonts w:cstheme="majorBidi" w:eastAsiaTheme="majorEastAsia"/>
-      <w:color w:themeColor="accent1" w:themeShade="BF" w:val="0F4761"/>
-    </w:rPr>
-  </w:style>
-  <w:style w:styleId="Heading6" w:type="paragraph">
+      <w:rFonts w:eastAsiaTheme="majorEastAsia" w:cstheme="majorBidi"/>
+      <w:color w:val="0F4761" w:themeColor="accent1" w:themeShade="BF"/>
+    </w:rPr>
+  </w:style>
+  <w:style w:type="paragraph" w:styleId="Heading6">
     <w:name w:val="heading 6"/>
     <w:basedOn w:val="Normal"/>
     <w:next w:val="BodyText"/>
@@ -1724,17 +1587,17 @@
     <w:pPr>
       <w:keepNext/>
       <w:keepLines/>
-      <w:spacing w:after="0" w:before="40"/>
+      <w:spacing w:before="40" w:after="0"/>
       <w:outlineLvl w:val="5"/>
     </w:pPr>
     <w:rPr>
-      <w:rFonts w:cstheme="majorBidi" w:eastAsiaTheme="majorEastAsia"/>
+      <w:rFonts w:eastAsiaTheme="majorEastAsia" w:cstheme="majorBidi"/>
       <w:i/>
       <w:iCs/>
-      <w:color w:themeColor="text1" w:themeTint="A6" w:val="595959"/>
-    </w:rPr>
-  </w:style>
-  <w:style w:styleId="Heading7" w:type="paragraph">
+      <w:color w:val="595959" w:themeColor="text1" w:themeTint="A6"/>
+    </w:rPr>
+  </w:style>
+  <w:style w:type="paragraph" w:styleId="Heading7">
     <w:name w:val="heading 7"/>
     <w:basedOn w:val="Normal"/>
     <w:next w:val="BodyText"/>
@@ -1747,15 +1610,15 @@
     <w:pPr>
       <w:keepNext/>
       <w:keepLines/>
-      <w:spacing w:after="0" w:before="40"/>
+      <w:spacing w:before="40" w:after="0"/>
       <w:outlineLvl w:val="6"/>
     </w:pPr>
     <w:rPr>
-      <w:rFonts w:cstheme="majorBidi" w:eastAsiaTheme="majorEastAsia"/>
-      <w:color w:themeColor="text1" w:themeTint="A6" w:val="595959"/>
-    </w:rPr>
-  </w:style>
-  <w:style w:styleId="Heading8" w:type="paragraph">
+      <w:rFonts w:eastAsiaTheme="majorEastAsia" w:cstheme="majorBidi"/>
+      <w:color w:val="595959" w:themeColor="text1" w:themeTint="A6"/>
+    </w:rPr>
+  </w:style>
+  <w:style w:type="paragraph" w:styleId="Heading8">
     <w:name w:val="heading 8"/>
     <w:basedOn w:val="Normal"/>
     <w:next w:val="BodyText"/>
@@ -1772,13 +1635,13 @@
       <w:outlineLvl w:val="7"/>
     </w:pPr>
     <w:rPr>
-      <w:rFonts w:cstheme="majorBidi" w:eastAsiaTheme="majorEastAsia"/>
+      <w:rFonts w:eastAsiaTheme="majorEastAsia" w:cstheme="majorBidi"/>
       <w:i/>
       <w:iCs/>
-      <w:color w:themeColor="text1" w:themeTint="D8" w:val="272727"/>
-    </w:rPr>
-  </w:style>
-  <w:style w:styleId="Heading9" w:type="paragraph">
+      <w:color w:val="272727" w:themeColor="text1" w:themeTint="D8"/>
+    </w:rPr>
+  </w:style>
+  <w:style w:type="paragraph" w:styleId="Heading9">
     <w:name w:val="heading 9"/>
     <w:basedOn w:val="Normal"/>
     <w:next w:val="BodyText"/>
@@ -1795,24 +1658,202 @@
       <w:outlineLvl w:val="8"/>
     </w:pPr>
     <w:rPr>
-      <w:rFonts w:cstheme="majorBidi" w:eastAsiaTheme="majorEastAsia"/>
-      <w:color w:themeColor="text1" w:themeTint="D8" w:val="272727"/>
-    </w:rPr>
-  </w:style>
-  <w:style w:customStyle="1" w:styleId="Heading1Char" w:type="character">
+      <w:rFonts w:eastAsiaTheme="majorEastAsia" w:cstheme="majorBidi"/>
+      <w:color w:val="272727" w:themeColor="text1" w:themeTint="D8"/>
+    </w:rPr>
+  </w:style>
+  <w:style w:type="character" w:default="1" w:styleId="DefaultParagraphFont">
+    <w:name w:val="Default Paragraph Font"/>
+    <w:uiPriority w:val="1"/>
+    <w:semiHidden/>
+    <w:unhideWhenUsed/>
+  </w:style>
+  <w:style w:type="table" w:default="1" w:styleId="TableNormal">
+    <w:name w:val="Normal Table"/>
+    <w:uiPriority w:val="99"/>
+    <w:semiHidden/>
+    <w:unhideWhenUsed/>
+    <w:tblPr>
+      <w:tblInd w:w="0" w:type="dxa"/>
+      <w:tblCellMar>
+        <w:top w:w="0" w:type="dxa"/>
+        <w:left w:w="108" w:type="dxa"/>
+        <w:bottom w:w="0" w:type="dxa"/>
+        <w:right w:w="108" w:type="dxa"/>
+      </w:tblCellMar>
+    </w:tblPr>
+  </w:style>
+  <w:style w:type="numbering" w:default="1" w:styleId="NoList">
+    <w:name w:val="No List"/>
+    <w:uiPriority w:val="99"/>
+    <w:semiHidden/>
+    <w:unhideWhenUsed/>
+  </w:style>
+  <w:style w:type="paragraph" w:styleId="BodyText">
+    <w:name w:val="Body Text"/>
+    <w:basedOn w:val="Normal"/>
+    <w:qFormat/>
+    <w:pPr>
+      <w:spacing w:before="180" w:after="180"/>
+    </w:pPr>
+  </w:style>
+  <w:style w:type="paragraph" w:customStyle="1" w:styleId="FirstParagraph">
+    <w:name w:val="First Paragraph"/>
+    <w:basedOn w:val="BodyText"/>
+    <w:next w:val="BodyText"/>
+    <w:qFormat/>
+  </w:style>
+  <w:style w:type="paragraph" w:customStyle="1" w:styleId="Compact">
+    <w:name w:val="Compact"/>
+    <w:basedOn w:val="BodyText"/>
+    <w:qFormat/>
+    <w:pPr>
+      <w:spacing w:before="36" w:after="36"/>
+    </w:pPr>
+  </w:style>
+  <w:style w:type="paragraph" w:styleId="Title">
+    <w:name w:val="Title"/>
+    <w:basedOn w:val="Normal"/>
+    <w:next w:val="BodyText"/>
+    <w:link w:val="TitleChar"/>
+    <w:uiPriority w:val="10"/>
+    <w:qFormat/>
+    <w:rsid w:val="00A10FD9"/>
+    <w:pPr>
+      <w:spacing w:after="80"/>
+      <w:contextualSpacing/>
+      <w:jc w:val="center"/>
+    </w:pPr>
+    <w:rPr>
+      <w:rFonts w:asciiTheme="majorHAnsi" w:eastAsiaTheme="majorEastAsia" w:hAnsiTheme="majorHAnsi" w:cstheme="majorBidi"/>
+      <w:sz w:val="56"/>
+      <w:szCs w:val="56"/>
+    </w:rPr>
+  </w:style>
+  <w:style w:type="character" w:customStyle="1" w:styleId="TitleChar">
+    <w:name w:val="Title Char"/>
+    <w:basedOn w:val="DefaultParagraphFont"/>
+    <w:link w:val="Title"/>
+    <w:uiPriority w:val="10"/>
+    <w:rsid w:val="00A10FD9"/>
+    <w:rPr>
+      <w:rFonts w:asciiTheme="majorHAnsi" w:eastAsiaTheme="majorEastAsia" w:hAnsiTheme="majorHAnsi" w:cstheme="majorBidi"/>
+      <w:sz w:val="56"/>
+      <w:szCs w:val="56"/>
+    </w:rPr>
+  </w:style>
+  <w:style w:type="paragraph" w:styleId="Subtitle">
+    <w:name w:val="Subtitle"/>
+    <w:basedOn w:val="Title"/>
+    <w:next w:val="BodyText"/>
+    <w:link w:val="SubtitleChar"/>
+    <w:uiPriority w:val="11"/>
+    <w:qFormat/>
+    <w:rsid w:val="00A10FD9"/>
+    <w:pPr>
+      <w:numPr>
+        <w:ilvl w:val="1"/>
+      </w:numPr>
+    </w:pPr>
+    <w:rPr>
+      <w:spacing w:val="15"/>
+      <w:sz w:val="28"/>
+      <w:szCs w:val="28"/>
+    </w:rPr>
+  </w:style>
+  <w:style w:type="character" w:customStyle="1" w:styleId="SubtitleChar">
+    <w:name w:val="Subtitle Char"/>
+    <w:basedOn w:val="DefaultParagraphFont"/>
+    <w:link w:val="Subtitle"/>
+    <w:uiPriority w:val="11"/>
+    <w:rsid w:val="00A10FD9"/>
+    <w:rPr>
+      <w:rFonts w:eastAsiaTheme="majorEastAsia" w:cstheme="majorBidi"/>
+      <w:color w:val="595959" w:themeColor="text1" w:themeTint="A6"/>
+      <w:spacing w:val="15"/>
+      <w:sz w:val="28"/>
+      <w:szCs w:val="28"/>
+    </w:rPr>
+  </w:style>
+  <w:style w:type="paragraph" w:customStyle="1" w:styleId="Author">
+    <w:name w:val="Author"/>
+    <w:basedOn w:val="Title"/>
+    <w:next w:val="BodyText"/>
+    <w:qFormat/>
+    <w:pPr>
+      <w:keepNext/>
+      <w:keepLines/>
+    </w:pPr>
+    <w:rPr>
+      <w:sz w:val="24"/>
+      <w:szCs w:val="24"/>
+    </w:rPr>
+  </w:style>
+  <w:style w:type="paragraph" w:styleId="Date">
+    <w:name w:val="Date"/>
+    <w:basedOn w:val="Title"/>
+    <w:next w:val="BodyText"/>
+    <w:qFormat/>
+    <w:pPr>
+      <w:keepNext/>
+      <w:keepLines/>
+    </w:pPr>
+    <w:rPr>
+      <w:sz w:val="24"/>
+      <w:szCs w:val="24"/>
+    </w:rPr>
+  </w:style>
+  <w:style w:type="paragraph" w:customStyle="1" w:styleId="AbstractTitle">
+    <w:name w:val="Abstract Title"/>
+    <w:basedOn w:val="Normal"/>
+    <w:next w:val="Abstract"/>
+    <w:qFormat/>
+    <w:pPr>
+      <w:keepNext/>
+      <w:keepLines/>
+      <w:spacing w:before="300" w:after="0"/>
+      <w:jc w:val="center"/>
+    </w:pPr>
+    <w:rPr>
+      <w:b/>
+      <w:sz w:val="20"/>
+      <w:szCs w:val="20"/>
+    </w:rPr>
+  </w:style>
+  <w:style w:type="paragraph" w:customStyle="1" w:styleId="Abstract">
+    <w:name w:val="Abstract"/>
+    <w:basedOn w:val="Normal"/>
+    <w:next w:val="BodyText"/>
+    <w:qFormat/>
+    <w:pPr>
+      <w:keepNext/>
+      <w:keepLines/>
+      <w:spacing w:before="100" w:after="300"/>
+    </w:pPr>
+    <w:rPr>
+      <w:sz w:val="20"/>
+      <w:szCs w:val="20"/>
+    </w:rPr>
+  </w:style>
+  <w:style w:type="paragraph" w:styleId="Bibliography">
+    <w:name w:val="Bibliography"/>
+    <w:basedOn w:val="Normal"/>
+    <w:qFormat/>
+  </w:style>
+  <w:style w:type="character" w:customStyle="1" w:styleId="Heading1Char">
     <w:name w:val="Heading 1 Char"/>
     <w:basedOn w:val="DefaultParagraphFont"/>
     <w:link w:val="Heading1"/>
     <w:uiPriority w:val="9"/>
     <w:rsid w:val="00A10FD9"/>
     <w:rPr>
-      <w:rFonts w:asciiTheme="majorHAnsi" w:cstheme="majorBidi" w:eastAsiaTheme="majorEastAsia" w:hAnsiTheme="majorHAnsi"/>
-      <w:color w:themeColor="accent1" w:themeShade="BF" w:val="0F4761"/>
+      <w:rFonts w:asciiTheme="majorHAnsi" w:eastAsiaTheme="majorEastAsia" w:hAnsiTheme="majorHAnsi" w:cstheme="majorBidi"/>
+      <w:color w:val="0F4761" w:themeColor="accent1" w:themeShade="BF"/>
       <w:sz w:val="40"/>
       <w:szCs w:val="40"/>
     </w:rPr>
   </w:style>
-  <w:style w:customStyle="1" w:styleId="Heading2Char" w:type="character">
+  <w:style w:type="character" w:customStyle="1" w:styleId="Heading2Char">
     <w:name w:val="Heading 2 Char"/>
     <w:basedOn w:val="DefaultParagraphFont"/>
     <w:link w:val="Heading2"/>
@@ -1820,13 +1861,13 @@
     <w:semiHidden/>
     <w:rsid w:val="00A10FD9"/>
     <w:rPr>
-      <w:rFonts w:asciiTheme="majorHAnsi" w:cstheme="majorBidi" w:eastAsiaTheme="majorEastAsia" w:hAnsiTheme="majorHAnsi"/>
-      <w:color w:themeColor="accent1" w:themeShade="BF" w:val="0F4761"/>
+      <w:rFonts w:asciiTheme="majorHAnsi" w:eastAsiaTheme="majorEastAsia" w:hAnsiTheme="majorHAnsi" w:cstheme="majorBidi"/>
+      <w:color w:val="0F4761" w:themeColor="accent1" w:themeShade="BF"/>
       <w:sz w:val="32"/>
       <w:szCs w:val="32"/>
     </w:rPr>
   </w:style>
-  <w:style w:customStyle="1" w:styleId="Heading3Char" w:type="character">
+  <w:style w:type="character" w:customStyle="1" w:styleId="Heading3Char">
     <w:name w:val="Heading 3 Char"/>
     <w:basedOn w:val="DefaultParagraphFont"/>
     <w:link w:val="Heading3"/>
@@ -1834,13 +1875,13 @@
     <w:semiHidden/>
     <w:rsid w:val="00A10FD9"/>
     <w:rPr>
-      <w:rFonts w:cstheme="majorBidi" w:eastAsiaTheme="majorEastAsia"/>
-      <w:color w:themeColor="accent1" w:themeShade="BF" w:val="0F4761"/>
+      <w:rFonts w:eastAsiaTheme="majorEastAsia" w:cstheme="majorBidi"/>
+      <w:color w:val="0F4761" w:themeColor="accent1" w:themeShade="BF"/>
       <w:sz w:val="28"/>
       <w:szCs w:val="28"/>
     </w:rPr>
   </w:style>
-  <w:style w:customStyle="1" w:styleId="Heading4Char" w:type="character">
+  <w:style w:type="character" w:customStyle="1" w:styleId="Heading4Char">
     <w:name w:val="Heading 4 Char"/>
     <w:basedOn w:val="DefaultParagraphFont"/>
     <w:link w:val="Heading4"/>
@@ -1848,13 +1889,13 @@
     <w:semiHidden/>
     <w:rsid w:val="00A10FD9"/>
     <w:rPr>
-      <w:rFonts w:cstheme="majorBidi" w:eastAsiaTheme="majorEastAsia"/>
+      <w:rFonts w:eastAsiaTheme="majorEastAsia" w:cstheme="majorBidi"/>
       <w:i/>
       <w:iCs/>
-      <w:color w:themeColor="accent1" w:themeShade="BF" w:val="0F4761"/>
-    </w:rPr>
-  </w:style>
-  <w:style w:customStyle="1" w:styleId="Heading5Char" w:type="character">
+      <w:color w:val="0F4761" w:themeColor="accent1" w:themeShade="BF"/>
+    </w:rPr>
+  </w:style>
+  <w:style w:type="character" w:customStyle="1" w:styleId="Heading5Char">
     <w:name w:val="Heading 5 Char"/>
     <w:basedOn w:val="DefaultParagraphFont"/>
     <w:link w:val="Heading5"/>
@@ -1862,11 +1903,11 @@
     <w:semiHidden/>
     <w:rsid w:val="00A10FD9"/>
     <w:rPr>
-      <w:rFonts w:cstheme="majorBidi" w:eastAsiaTheme="majorEastAsia"/>
-      <w:color w:themeColor="accent1" w:themeShade="BF" w:val="0F4761"/>
-    </w:rPr>
-  </w:style>
-  <w:style w:customStyle="1" w:styleId="Heading6Char" w:type="character">
+      <w:rFonts w:eastAsiaTheme="majorEastAsia" w:cstheme="majorBidi"/>
+      <w:color w:val="0F4761" w:themeColor="accent1" w:themeShade="BF"/>
+    </w:rPr>
+  </w:style>
+  <w:style w:type="character" w:customStyle="1" w:styleId="Heading6Char">
     <w:name w:val="Heading 6 Char"/>
     <w:basedOn w:val="DefaultParagraphFont"/>
     <w:link w:val="Heading6"/>
@@ -1874,13 +1915,13 @@
     <w:semiHidden/>
     <w:rsid w:val="00A10FD9"/>
     <w:rPr>
-      <w:rFonts w:cstheme="majorBidi" w:eastAsiaTheme="majorEastAsia"/>
+      <w:rFonts w:eastAsiaTheme="majorEastAsia" w:cstheme="majorBidi"/>
       <w:i/>
       <w:iCs/>
-      <w:color w:themeColor="text1" w:themeTint="A6" w:val="595959"/>
-    </w:rPr>
-  </w:style>
-  <w:style w:customStyle="1" w:styleId="Heading7Char" w:type="character">
+      <w:color w:val="595959" w:themeColor="text1" w:themeTint="A6"/>
+    </w:rPr>
+  </w:style>
+  <w:style w:type="character" w:customStyle="1" w:styleId="Heading7Char">
     <w:name w:val="Heading 7 Char"/>
     <w:basedOn w:val="DefaultParagraphFont"/>
     <w:link w:val="Heading7"/>
@@ -1888,11 +1929,11 @@
     <w:semiHidden/>
     <w:rsid w:val="00A10FD9"/>
     <w:rPr>
-      <w:rFonts w:cstheme="majorBidi" w:eastAsiaTheme="majorEastAsia"/>
-      <w:color w:themeColor="text1" w:themeTint="A6" w:val="595959"/>
-    </w:rPr>
-  </w:style>
-  <w:style w:customStyle="1" w:styleId="Heading8Char" w:type="character">
+      <w:rFonts w:eastAsiaTheme="majorEastAsia" w:cstheme="majorBidi"/>
+      <w:color w:val="595959" w:themeColor="text1" w:themeTint="A6"/>
+    </w:rPr>
+  </w:style>
+  <w:style w:type="character" w:customStyle="1" w:styleId="Heading8Char">
     <w:name w:val="Heading 8 Char"/>
     <w:basedOn w:val="DefaultParagraphFont"/>
     <w:link w:val="Heading8"/>
@@ -1900,13 +1941,13 @@
     <w:semiHidden/>
     <w:rsid w:val="00A10FD9"/>
     <w:rPr>
-      <w:rFonts w:cstheme="majorBidi" w:eastAsiaTheme="majorEastAsia"/>
+      <w:rFonts w:eastAsiaTheme="majorEastAsia" w:cstheme="majorBidi"/>
       <w:i/>
       <w:iCs/>
-      <w:color w:themeColor="text1" w:themeTint="D8" w:val="272727"/>
-    </w:rPr>
-  </w:style>
-  <w:style w:customStyle="1" w:styleId="Heading9Char" w:type="character">
+      <w:color w:val="272727" w:themeColor="text1" w:themeTint="D8"/>
+    </w:rPr>
+  </w:style>
+  <w:style w:type="character" w:customStyle="1" w:styleId="Heading9Char">
     <w:name w:val="Heading 9 Char"/>
     <w:basedOn w:val="DefaultParagraphFont"/>
     <w:link w:val="Heading9"/>
@@ -1914,11 +1955,11 @@
     <w:semiHidden/>
     <w:rsid w:val="00A10FD9"/>
     <w:rPr>
-      <w:rFonts w:cstheme="majorBidi" w:eastAsiaTheme="majorEastAsia"/>
-      <w:color w:themeColor="text1" w:themeTint="D8" w:val="272727"/>
-    </w:rPr>
-  </w:style>
-  <w:style w:styleId="BlockText" w:type="paragraph">
+      <w:rFonts w:eastAsiaTheme="majorEastAsia" w:cstheme="majorBidi"/>
+      <w:color w:val="272727" w:themeColor="text1" w:themeTint="D8"/>
+    </w:rPr>
+  </w:style>
+  <w:style w:type="paragraph" w:styleId="BlockText">
     <w:name w:val="Block Text"/>
     <w:basedOn w:val="BodyText"/>
     <w:next w:val="BodyText"/>
@@ -1926,19 +1967,18 @@
     <w:unhideWhenUsed/>
     <w:qFormat/>
     <w:pPr>
-      <w:spacing w:after="100" w:before="100"/>
-      <w:ind w:firstLine="0" w:left="480" w:right="480"/>
+      <w:spacing w:before="100" w:after="100"/>
+      <w:ind w:left="480" w:right="480"/>
     </w:pPr>
   </w:style>
-  <w:style w:styleId="FootnoteText" w:type="paragraph">
-    <w:name w:val="Footnote Text"/>
+  <w:style w:type="paragraph" w:styleId="FootnoteText">
+    <w:name w:val="footnote text"/>
     <w:basedOn w:val="Normal"/>
-    <w:next w:val="FootnoteText"/>
     <w:uiPriority w:val="9"/>
     <w:unhideWhenUsed/>
     <w:qFormat/>
   </w:style>
-  <w:style w:styleId="FootnoteBlockText" w:type="paragraph">
+  <w:style w:type="paragraph" w:customStyle="1" w:styleId="FootnoteBlockText">
     <w:name w:val="Footnote Block Text"/>
     <w:basedOn w:val="FootnoteText"/>
     <w:next w:val="FootnoteText"/>
@@ -1946,40 +1986,35 @@
     <w:unhideWhenUsed/>
     <w:qFormat/>
     <w:pPr>
-      <w:spacing w:after="100" w:before="100"/>
-      <w:ind w:firstLine="0" w:left="480" w:right="480"/>
+      <w:spacing w:before="100" w:after="100"/>
+      <w:ind w:left="480" w:right="480"/>
     </w:pPr>
   </w:style>
-  <w:style w:default="1" w:styleId="DefaultParagraphFont" w:type="character">
-    <w:name w:val="Default Paragraph Font"/>
-    <w:semiHidden/>
-    <w:unhideWhenUsed/>
-  </w:style>
-  <w:style w:default="1" w:styleId="Table" w:type="table">
+  <w:style w:type="table" w:customStyle="1" w:styleId="Table">
     <w:name w:val="Table"/>
-    <w:basedOn w:val="TableNormal"/>
     <w:semiHidden/>
     <w:unhideWhenUsed/>
     <w:qFormat/>
     <w:tblPr>
-      <w:tblInd w:type="dxa" w:w="0"/>
+      <w:tblInd w:w="0" w:type="dxa"/>
       <w:tblCellMar>
-        <w:top w:type="dxa" w:w="0"/>
-        <w:left w:type="dxa" w:w="108"/>
-        <w:bottom w:type="dxa" w:w="0"/>
-        <w:right w:type="dxa" w:w="108"/>
+        <w:top w:w="0" w:type="dxa"/>
+        <w:left w:w="108" w:type="dxa"/>
+        <w:bottom w:w="0" w:type="dxa"/>
+        <w:right w:w="108" w:type="dxa"/>
       </w:tblCellMar>
     </w:tblPr>
     <w:tblStylePr w:type="firstRow">
+      <w:tblPr/>
       <w:tcPr>
         <w:tcBorders>
-          <w:bottom w:val="single"/>
+          <w:bottom w:val="single" w:sz="0" w:space="0" w:color="auto"/>
         </w:tcBorders>
         <w:vAlign w:val="bottom"/>
       </w:tcPr>
     </w:tblStylePr>
   </w:style>
-  <w:style w:customStyle="1" w:styleId="DefinitionTerm" w:type="paragraph">
+  <w:style w:type="paragraph" w:customStyle="1" w:styleId="DefinitionTerm">
     <w:name w:val="Definition Term"/>
     <w:basedOn w:val="Normal"/>
     <w:next w:val="Definition"/>
@@ -1992,75 +2027,76 @@
       <w:b/>
     </w:rPr>
   </w:style>
-  <w:style w:customStyle="1" w:styleId="Definition" w:type="paragraph">
+  <w:style w:type="paragraph" w:customStyle="1" w:styleId="Definition">
     <w:name w:val="Definition"/>
     <w:basedOn w:val="Normal"/>
   </w:style>
-  <w:style w:styleId="Caption" w:type="paragraph">
-    <w:name w:val="Caption"/>
+  <w:style w:type="paragraph" w:styleId="Caption">
+    <w:name w:val="caption"/>
     <w:basedOn w:val="Normal"/>
-    <w:link w:val="BodyTextChar"/>
+    <w:link w:val="CaptionChar"/>
     <w:pPr>
-      <w:spacing w:after="120" w:before="0"/>
+      <w:spacing w:after="120"/>
     </w:pPr>
     <w:rPr>
       <w:i/>
     </w:rPr>
   </w:style>
-  <w:style w:customStyle="1" w:styleId="TableCaption" w:type="paragraph">
+  <w:style w:type="paragraph" w:customStyle="1" w:styleId="TableCaption">
     <w:name w:val="Table Caption"/>
     <w:basedOn w:val="Caption"/>
     <w:pPr>
       <w:keepNext/>
     </w:pPr>
   </w:style>
-  <w:style w:customStyle="1" w:styleId="ImageCaption" w:type="paragraph">
+  <w:style w:type="paragraph" w:customStyle="1" w:styleId="ImageCaption">
     <w:name w:val="Image Caption"/>
     <w:basedOn w:val="Caption"/>
   </w:style>
-  <w:style w:customStyle="1" w:styleId="Figure" w:type="paragraph">
+  <w:style w:type="paragraph" w:customStyle="1" w:styleId="Figure">
     <w:name w:val="Figure"/>
     <w:basedOn w:val="Normal"/>
   </w:style>
-  <w:style w:customStyle="1" w:styleId="CaptionedFigure" w:type="paragraph">
+  <w:style w:type="paragraph" w:customStyle="1" w:styleId="CaptionedFigure">
     <w:name w:val="Captioned Figure"/>
     <w:basedOn w:val="Figure"/>
     <w:pPr>
       <w:keepNext/>
     </w:pPr>
   </w:style>
-  <w:style w:customStyle="1" w:styleId="BodyTextChar" w:type="character">
-    <w:name w:val="Body Text Char"/>
+  <w:style w:type="character" w:customStyle="1" w:styleId="CaptionChar">
+    <w:name w:val="Caption Char"/>
     <w:basedOn w:val="DefaultParagraphFont"/>
-    <w:link w:val="BodyText"/>
-  </w:style>
-  <w:style w:customStyle="1" w:styleId="VerbatimChar" w:type="character">
+    <w:link w:val="Caption"/>
+  </w:style>
+  <w:style w:type="character" w:customStyle="1" w:styleId="VerbatimChar">
     <w:name w:val="Verbatim Char"/>
-    <w:basedOn w:val="BodyTextChar"/>
-    <w:rPr>
-      <w:rFonts w:ascii="Consolas" w:hAnsi="Consolas"/>
-      <w:sz w:val="22"/>
-    </w:rPr>
-  </w:style>
-  <w:style w:customStyle="1" w:styleId="SectionNumber" w:type="character">
+    <w:basedOn w:val="CaptionChar"/>
+    <w:link w:val="SourceCode"/>
+    <w:rPr>
+      <w:rFonts w:ascii="Consolas" w:hAnsi="Consolas"/>
+      <w:sz w:val="22"/>
+    </w:rPr>
+  </w:style>
+  <w:style w:type="character" w:customStyle="1" w:styleId="SectionNumber">
     <w:name w:val="Section Number"/>
-    <w:basedOn w:val="BodyTextChar"/>
-  </w:style>
-  <w:style w:styleId="FootnoteReference" w:type="character">
-    <w:name w:val="Footnote Reference"/>
-    <w:basedOn w:val="BodyTextChar"/>
+    <w:basedOn w:val="CaptionChar"/>
+  </w:style>
+  <w:style w:type="character" w:styleId="FootnoteReference">
+    <w:name w:val="footnote reference"/>
+    <w:basedOn w:val="CaptionChar"/>
     <w:rPr>
       <w:vertAlign w:val="superscript"/>
     </w:rPr>
   </w:style>
-  <w:style w:styleId="Hyperlink" w:type="character">
+  <w:style w:type="character" w:styleId="Hyperlink">
     <w:name w:val="Hyperlink"/>
-    <w:basedOn w:val="BodyTextChar"/>
-    <w:rPr>
-      <w:color w:themeColor="accent1" w:val="4F81BD"/>
-    </w:rPr>
-  </w:style>
-  <w:style w:styleId="TOCHeading" w:type="paragraph">
+    <w:basedOn w:val="CaptionChar"/>
+    <w:rPr>
+      <w:color w:val="156082" w:themeColor="accent1"/>
+    </w:rPr>
+  </w:style>
+  <w:style w:type="paragraph" w:styleId="TOCHeading">
     <w:name w:val="TOC Heading"/>
     <w:basedOn w:val="Heading1"/>
     <w:next w:val="BodyText"/>
@@ -2071,246 +2107,305 @@
       <w:spacing w:before="240" w:line="259" w:lineRule="auto"/>
       <w:outlineLvl w:val="9"/>
     </w:pPr>
-    <w:rPr>
-      <w:rFonts w:asciiTheme="majorHAnsi" w:cstheme="majorBidi" w:eastAsiaTheme="majorEastAsia" w:hAnsiTheme="majorHAnsi"/>
-      <w:b w:val="0"/>
-      <w:bCs w:val="0"/>
-      <w:color w:themeColor="accent1" w:themeShade="BF" w:val="365F91"/>
-    </w:rPr>
   </w:style>
   <w:style w:type="paragraph" w:customStyle="1" w:styleId="SourceCode">
     <w:name w:val="Source Code"/>
     <w:basedOn w:val="Normal"/>
     <w:link w:val="VerbatimChar"/>
     <w:pPr>
-      <w:wordWrap w:val="off"/>
+      <w:wordWrap w:val="0"/>
     </w:pPr>
   </w:style>
   <w:style w:type="character" w:customStyle="1" w:styleId="KeywordTok">
     <w:name w:val="KeywordTok"/>
     <w:basedOn w:val="VerbatimChar"/>
     <w:rPr>
+      <w:rFonts w:ascii="Consolas" w:hAnsi="Consolas"/>
       <w:b/>
       <w:color w:val="007020"/>
+      <w:sz w:val="22"/>
     </w:rPr>
   </w:style>
   <w:style w:type="character" w:customStyle="1" w:styleId="DataTypeTok">
     <w:name w:val="DataTypeTok"/>
     <w:basedOn w:val="VerbatimChar"/>
     <w:rPr>
+      <w:rFonts w:ascii="Consolas" w:hAnsi="Consolas"/>
       <w:color w:val="902000"/>
+      <w:sz w:val="22"/>
     </w:rPr>
   </w:style>
   <w:style w:type="character" w:customStyle="1" w:styleId="DecValTok">
     <w:name w:val="DecValTok"/>
     <w:basedOn w:val="VerbatimChar"/>
     <w:rPr>
-      <w:color w:val="40a070"/>
+      <w:rFonts w:ascii="Consolas" w:hAnsi="Consolas"/>
+      <w:color w:val="40A070"/>
+      <w:sz w:val="22"/>
     </w:rPr>
   </w:style>
   <w:style w:type="character" w:customStyle="1" w:styleId="BaseNTok">
     <w:name w:val="BaseNTok"/>
     <w:basedOn w:val="VerbatimChar"/>
     <w:rPr>
-      <w:color w:val="40a070"/>
+      <w:rFonts w:ascii="Consolas" w:hAnsi="Consolas"/>
+      <w:color w:val="40A070"/>
+      <w:sz w:val="22"/>
     </w:rPr>
   </w:style>
   <w:style w:type="character" w:customStyle="1" w:styleId="FloatTok">
     <w:name w:val="FloatTok"/>
     <w:basedOn w:val="VerbatimChar"/>
     <w:rPr>
-      <w:color w:val="40a070"/>
+      <w:rFonts w:ascii="Consolas" w:hAnsi="Consolas"/>
+      <w:color w:val="40A070"/>
+      <w:sz w:val="22"/>
     </w:rPr>
   </w:style>
   <w:style w:type="character" w:customStyle="1" w:styleId="ConstantTok">
     <w:name w:val="ConstantTok"/>
     <w:basedOn w:val="VerbatimChar"/>
     <w:rPr>
+      <w:rFonts w:ascii="Consolas" w:hAnsi="Consolas"/>
       <w:color w:val="880000"/>
+      <w:sz w:val="22"/>
     </w:rPr>
   </w:style>
   <w:style w:type="character" w:customStyle="1" w:styleId="CharTok">
     <w:name w:val="CharTok"/>
     <w:basedOn w:val="VerbatimChar"/>
     <w:rPr>
-      <w:color w:val="4070a0"/>
+      <w:rFonts w:ascii="Consolas" w:hAnsi="Consolas"/>
+      <w:color w:val="4070A0"/>
+      <w:sz w:val="22"/>
     </w:rPr>
   </w:style>
   <w:style w:type="character" w:customStyle="1" w:styleId="SpecialCharTok">
     <w:name w:val="SpecialCharTok"/>
     <w:basedOn w:val="VerbatimChar"/>
     <w:rPr>
-      <w:color w:val="4070a0"/>
+      <w:rFonts w:ascii="Consolas" w:hAnsi="Consolas"/>
+      <w:color w:val="4070A0"/>
+      <w:sz w:val="22"/>
     </w:rPr>
   </w:style>
   <w:style w:type="character" w:customStyle="1" w:styleId="StringTok">
     <w:name w:val="StringTok"/>
     <w:basedOn w:val="VerbatimChar"/>
     <w:rPr>
-      <w:color w:val="4070a0"/>
+      <w:rFonts w:ascii="Consolas" w:hAnsi="Consolas"/>
+      <w:color w:val="4070A0"/>
+      <w:sz w:val="22"/>
     </w:rPr>
   </w:style>
   <w:style w:type="character" w:customStyle="1" w:styleId="VerbatimStringTok">
     <w:name w:val="VerbatimStringTok"/>
     <w:basedOn w:val="VerbatimChar"/>
     <w:rPr>
-      <w:color w:val="4070a0"/>
+      <w:rFonts w:ascii="Consolas" w:hAnsi="Consolas"/>
+      <w:color w:val="4070A0"/>
+      <w:sz w:val="22"/>
     </w:rPr>
   </w:style>
   <w:style w:type="character" w:customStyle="1" w:styleId="SpecialStringTok">
     <w:name w:val="SpecialStringTok"/>
     <w:basedOn w:val="VerbatimChar"/>
     <w:rPr>
-      <w:color w:val="bb6688"/>
+      <w:rFonts w:ascii="Consolas" w:hAnsi="Consolas"/>
+      <w:color w:val="BB6688"/>
+      <w:sz w:val="22"/>
     </w:rPr>
   </w:style>
   <w:style w:type="character" w:customStyle="1" w:styleId="ImportTok">
     <w:name w:val="ImportTok"/>
     <w:basedOn w:val="VerbatimChar"/>
     <w:rPr>
+      <w:rFonts w:ascii="Consolas" w:hAnsi="Consolas"/>
       <w:b/>
       <w:color w:val="008000"/>
+      <w:sz w:val="22"/>
     </w:rPr>
   </w:style>
   <w:style w:type="character" w:customStyle="1" w:styleId="CommentTok">
     <w:name w:val="CommentTok"/>
     <w:basedOn w:val="VerbatimChar"/>
     <w:rPr>
+      <w:rFonts w:ascii="Consolas" w:hAnsi="Consolas"/>
       <w:i/>
-      <w:color w:val="60a0b0"/>
+      <w:color w:val="60A0B0"/>
+      <w:sz w:val="22"/>
     </w:rPr>
   </w:style>
   <w:style w:type="character" w:customStyle="1" w:styleId="DocumentationTok">
     <w:name w:val="DocumentationTok"/>
     <w:basedOn w:val="VerbatimChar"/>
     <w:rPr>
+      <w:rFonts w:ascii="Consolas" w:hAnsi="Consolas"/>
       <w:i/>
-      <w:color w:val="ba2121"/>
+      <w:color w:val="BA2121"/>
+      <w:sz w:val="22"/>
     </w:rPr>
   </w:style>
   <w:style w:type="character" w:customStyle="1" w:styleId="AnnotationTok">
     <w:name w:val="AnnotationTok"/>
     <w:basedOn w:val="VerbatimChar"/>
     <w:rPr>
+      <w:rFonts w:ascii="Consolas" w:hAnsi="Consolas"/>
       <w:b/>
       <w:i/>
-      <w:color w:val="60a0b0"/>
+      <w:color w:val="60A0B0"/>
+      <w:sz w:val="22"/>
     </w:rPr>
   </w:style>
   <w:style w:type="character" w:customStyle="1" w:styleId="CommentVarTok">
     <w:name w:val="CommentVarTok"/>
     <w:basedOn w:val="VerbatimChar"/>
     <w:rPr>
+      <w:rFonts w:ascii="Consolas" w:hAnsi="Consolas"/>
       <w:b/>
       <w:i/>
-      <w:color w:val="60a0b0"/>
+      <w:color w:val="60A0B0"/>
+      <w:sz w:val="22"/>
     </w:rPr>
   </w:style>
   <w:style w:type="character" w:customStyle="1" w:styleId="OtherTok">
     <w:name w:val="OtherTok"/>
     <w:basedOn w:val="VerbatimChar"/>
     <w:rPr>
+      <w:rFonts w:ascii="Consolas" w:hAnsi="Consolas"/>
       <w:color w:val="007020"/>
+      <w:sz w:val="22"/>
     </w:rPr>
   </w:style>
   <w:style w:type="character" w:customStyle="1" w:styleId="FunctionTok">
     <w:name w:val="FunctionTok"/>
     <w:basedOn w:val="VerbatimChar"/>
     <w:rPr>
-      <w:color w:val="06287e"/>
+      <w:rFonts w:ascii="Consolas" w:hAnsi="Consolas"/>
+      <w:color w:val="06287E"/>
+      <w:sz w:val="22"/>
     </w:rPr>
   </w:style>
   <w:style w:type="character" w:customStyle="1" w:styleId="VariableTok">
     <w:name w:val="VariableTok"/>
     <w:basedOn w:val="VerbatimChar"/>
     <w:rPr>
-      <w:color w:val="19177c"/>
+      <w:rFonts w:ascii="Consolas" w:hAnsi="Consolas"/>
+      <w:color w:val="19177C"/>
+      <w:sz w:val="22"/>
     </w:rPr>
   </w:style>
   <w:style w:type="character" w:customStyle="1" w:styleId="ControlFlowTok">
     <w:name w:val="ControlFlowTok"/>
     <w:basedOn w:val="VerbatimChar"/>
     <w:rPr>
+      <w:rFonts w:ascii="Consolas" w:hAnsi="Consolas"/>
       <w:b/>
       <w:color w:val="007020"/>
+      <w:sz w:val="22"/>
     </w:rPr>
   </w:style>
   <w:style w:type="character" w:customStyle="1" w:styleId="OperatorTok">
     <w:name w:val="OperatorTok"/>
     <w:basedOn w:val="VerbatimChar"/>
     <w:rPr>
+      <w:rFonts w:ascii="Consolas" w:hAnsi="Consolas"/>
       <w:color w:val="666666"/>
+      <w:sz w:val="22"/>
     </w:rPr>
   </w:style>
   <w:style w:type="character" w:customStyle="1" w:styleId="BuiltInTok">
     <w:name w:val="BuiltInTok"/>
     <w:basedOn w:val="VerbatimChar"/>
     <w:rPr>
+      <w:rFonts w:ascii="Consolas" w:hAnsi="Consolas"/>
       <w:color w:val="008000"/>
+      <w:sz w:val="22"/>
     </w:rPr>
   </w:style>
   <w:style w:type="character" w:customStyle="1" w:styleId="ExtensionTok">
     <w:name w:val="ExtensionTok"/>
     <w:basedOn w:val="VerbatimChar"/>
-    <w:rPr/>
+    <w:rPr>
+      <w:rFonts w:ascii="Consolas" w:hAnsi="Consolas"/>
+      <w:sz w:val="22"/>
+    </w:rPr>
   </w:style>
   <w:style w:type="character" w:customStyle="1" w:styleId="PreprocessorTok">
     <w:name w:val="PreprocessorTok"/>
     <w:basedOn w:val="VerbatimChar"/>
     <w:rPr>
-      <w:color w:val="bc7a00"/>
+      <w:rFonts w:ascii="Consolas" w:hAnsi="Consolas"/>
+      <w:color w:val="BC7A00"/>
+      <w:sz w:val="22"/>
     </w:rPr>
   </w:style>
   <w:style w:type="character" w:customStyle="1" w:styleId="AttributeTok">
     <w:name w:val="AttributeTok"/>
     <w:basedOn w:val="VerbatimChar"/>
     <w:rPr>
-      <w:color w:val="7d9029"/>
+      <w:rFonts w:ascii="Consolas" w:hAnsi="Consolas"/>
+      <w:color w:val="7D9029"/>
+      <w:sz w:val="22"/>
     </w:rPr>
   </w:style>
   <w:style w:type="character" w:customStyle="1" w:styleId="RegionMarkerTok">
     <w:name w:val="RegionMarkerTok"/>
     <w:basedOn w:val="VerbatimChar"/>
-    <w:rPr/>
+    <w:rPr>
+      <w:rFonts w:ascii="Consolas" w:hAnsi="Consolas"/>
+      <w:sz w:val="22"/>
+    </w:rPr>
   </w:style>
   <w:style w:type="character" w:customStyle="1" w:styleId="InformationTok">
     <w:name w:val="InformationTok"/>
     <w:basedOn w:val="VerbatimChar"/>
     <w:rPr>
+      <w:rFonts w:ascii="Consolas" w:hAnsi="Consolas"/>
       <w:b/>
       <w:i/>
-      <w:color w:val="60a0b0"/>
+      <w:color w:val="60A0B0"/>
+      <w:sz w:val="22"/>
     </w:rPr>
   </w:style>
   <w:style w:type="character" w:customStyle="1" w:styleId="WarningTok">
     <w:name w:val="WarningTok"/>
     <w:basedOn w:val="VerbatimChar"/>
     <w:rPr>
+      <w:rFonts w:ascii="Consolas" w:hAnsi="Consolas"/>
       <w:b/>
       <w:i/>
-      <w:color w:val="60a0b0"/>
+      <w:color w:val="60A0B0"/>
+      <w:sz w:val="22"/>
     </w:rPr>
   </w:style>
   <w:style w:type="character" w:customStyle="1" w:styleId="AlertTok">
     <w:name w:val="AlertTok"/>
     <w:basedOn w:val="VerbatimChar"/>
     <w:rPr>
+      <w:rFonts w:ascii="Consolas" w:hAnsi="Consolas"/>
       <w:b/>
-      <w:color w:val="ff0000"/>
+      <w:color w:val="FF0000"/>
+      <w:sz w:val="22"/>
     </w:rPr>
   </w:style>
   <w:style w:type="character" w:customStyle="1" w:styleId="ErrorTok">
     <w:name w:val="ErrorTok"/>
     <w:basedOn w:val="VerbatimChar"/>
     <w:rPr>
+      <w:rFonts w:ascii="Consolas" w:hAnsi="Consolas"/>
       <w:b/>
-      <w:color w:val="ff0000"/>
+      <w:color w:val="FF0000"/>
+      <w:sz w:val="22"/>
     </w:rPr>
   </w:style>
   <w:style w:type="character" w:customStyle="1" w:styleId="NormalTok">
     <w:name w:val="NormalTok"/>
     <w:basedOn w:val="VerbatimChar"/>
-    <w:rPr/>
+    <w:rPr>
+      <w:rFonts w:ascii="Consolas" w:hAnsi="Consolas"/>
+      <w:sz w:val="22"/>
+    </w:rPr>
   </w:style>
 </w:styles>
 </file>

</xml_diff>